<commit_message>
Expand HRES chapter to 7800 words with 4 figures embedded twice in text
</commit_message>
<xml_diff>
--- a/HRES_Economic_Analysis_Chapter.docx
+++ b/HRES_Economic_Analysis_Chapter.docx
@@ -100,25 +100,25 @@
       </w:pPr>
       <w:r>
         <w:rPr/>
-        <w:t xml:space="preserve">The transition toward sustainable energy systems represents one of the most significant techno-economic challenges of the twenty-first century [5]. As nations pursue aggressive decarbonization targets aligned with the Paris Agreement and subsequent climate commitments, the deployment of renewable energy technologies has accelerated dramatically [6]. However, the inherent variability and intermittency of individual renewable energy sources—particularly solar photovoltaic (PV) and wind energy—present fundamental challenges to grid stability, reliability, and economic dispatch optimization [7]. Hybrid Renewable Energy Systems address these limitations by synergistically combining multiple generation technologies, energy storage systems, and intelligent management platforms within unified architectures [8].</w:t>
-      </w:r>
-    </w:p>
-    <w:p>
-      <w:pPr>
-        <w:spacing w:after="120" w:line="276" w:lineRule="auto"/>
-      </w:pPr>
-      <w:r>
-        <w:rPr/>
-        <w:t xml:space="preserve">A typical HRES configuration may integrate solar PV arrays, wind turbines, battery energy storage systems (BESS), hydrogen electrolyzers and fuel cells, and potentially conventional backup generators within a unified control architecture [9]. The complementary nature of these resources—where solar generation peaks during daytime hours and wind resources often exhibit stronger profiles during evening and nighttime periods—enables more consistent power output and enhanced system reliability [10]. The economic dimension of HRES has evolved considerably over the past decade. According to recent analyses, solar PV technology maintains its position as the world's most cost-competitive power generation source, with single-axis tracker systems achieving levelized costs as low as USD 37/MWh in optimal regions [11]. When combined with storage technologies, firm power delivery from hybrid solar-plus-storage systems ranges from approximately USD 54–82/MWh, representing a dramatic reduction from over USD 100/MWh in 2020 [12].</w:t>
-      </w:r>
-    </w:p>
-    <w:p>
-      <w:pPr>
-        <w:spacing w:after="120" w:line="276" w:lineRule="auto"/>
-      </w:pPr>
-      <w:r>
-        <w:rPr/>
-        <w:t xml:space="preserve">The “smart” dimension of modern HRES introduces sophisticated optimization capabilities through artificial intelligence, machine learning, and advanced control systems [14]. These intelligent management layers enable real-time energy forecasting, dynamic resource allocation, predictive maintenance scheduling, and optimal market participation strategies [15]. The integration of metaheuristic algorithms with machine learning has enabled dynamic adaptability and predictive optimization, paving the way for real-time energy management that maximizes both technical performance and economic returns [16].</w:t>
+        <w:t xml:space="preserve">The transition toward sustainable energy systems represents one of the most significant techno-economic challenges of the twenty-first century [5]. As nations pursue aggressive decarbonization targets aligned with the Paris Agreement and subsequent climate commitments, the deployment of renewable energy technologies has accelerated dramatically [6]. However, the inherent variability and intermittency of individual renewable energy sources—particularly solar photovoltaic (PV) and wind energy—present fundamental challenges to grid stability, reliability, and economic dispatch optimization [7]. Hybrid Renewable Energy Systems address these limitations by synergistically combining multiple generation technologies, energy storage systems, and intelligent management platforms within unified architectures [8]. The fundamental premise underlying HRES deployment is that the combination of complementary resources yields superior techno-economic performance compared to any single technology deployed in isolation, while simultaneously enhancing supply security and reducing dependence on fossil fuel backup generation [9].</w:t>
+      </w:r>
+    </w:p>
+    <w:p>
+      <w:pPr>
+        <w:spacing w:after="120" w:line="276" w:lineRule="auto"/>
+      </w:pPr>
+      <w:r>
+        <w:rPr/>
+        <w:t xml:space="preserve">A typical HRES configuration may integrate solar PV arrays, wind turbines, battery energy storage systems (BESS), hydrogen electrolyzers and fuel cells, and potentially conventional backup generators within a unified control architecture [9]. The complementary nature of these resources—where solar generation peaks during daytime hours and wind resources often exhibit stronger profiles during evening and nighttime periods—enables more consistent power output and enhanced system reliability [10]. The economic dimension of HRES has evolved considerably over the past decade, driven by dramatic cost reductions in key component technologies and the maturation of intelligent energy management systems. According to recent analyses, solar PV technology maintains its position as the world's most cost-competitive power generation source, with single-axis tracker systems achieving levelized costs as low as USD 37/MWh in optimal regions [11]. When combined with storage technologies, firm power delivery from hybrid solar-plus-storage systems ranges from approximately USD 54–82/MWh, representing a dramatic reduction from over USD 100/MWh in 2020 [12]. These cost trajectories fundamentally alter the economic calculus for energy system planning and investment decisions worldwide [13].</w:t>
+      </w:r>
+    </w:p>
+    <w:p>
+      <w:pPr>
+        <w:spacing w:after="120" w:line="276" w:lineRule="auto"/>
+      </w:pPr>
+      <w:r>
+        <w:rPr/>
+        <w:t xml:space="preserve">The “smart” dimension of modern HRES introduces sophisticated optimization capabilities through artificial intelligence, machine learning, and advanced control systems [14]. These intelligent management layers enable real-time energy forecasting, dynamic resource allocation, predictive maintenance scheduling, and optimal market participation strategies [15]. The integration of metaheuristic algorithms with machine learning has enabled dynamic adaptability and predictive optimization, paving the way for real-time energy management that maximizes both technical performance and economic returns [16]. Furthermore, the proliferation of Internet of Things sensors, edge computing platforms, and high-bandwidth communication networks provides the digital infrastructure necessary to support millisecond-scale control decisions across distributed generation and storage assets. This chapter examines the economic analysis and market integration of smart HRES across four comprehensive sections covering economic evaluation frameworks, market structures and intelligent optimization, emerging business models and risk assessment, and future perspectives with detailed case studies demonstrating real-world economic performance across diverse deployment contexts.</w:t>
       </w:r>
     </w:p>
     <w:p>
@@ -193,16 +193,16 @@
       </w:pPr>
       <w:r>
         <w:rPr/>
-        <w:t xml:space="preserve">The Levelized Cost of Energy represents the fundamental metric for comparing the economic competitiveness of different generation technologies on a consistent basis [23]. LCOE captures the total lifecycle cost of building and operating a power generation asset, expressed as a per-unit cost of energy produced over the system's economic lifetime [24]. For hybrid renewable energy systems, the LCOE calculation must account for the complex interactions between multiple generation and storage components [25]. The formula incorporates investment expenditures (I_t), operations and maintenance costs (M_t), fuel expenditures (F_t), storage system costs (S_t), electricity generation (E_t), discount rate (r), and system lifetime (N).</w:t>
-      </w:r>
-    </w:p>
-    <w:p>
-      <w:pPr>
-        <w:spacing w:after="120" w:line="276" w:lineRule="auto"/>
-      </w:pPr>
-      <w:r>
-        <w:rPr/>
-        <w:t xml:space="preserve">The LCOE for HRES configurations varies significantly based on resource availability, system architecture, and geographic location [26]. Recent techno-economic analyses demonstrate that PV/Wind/Pumped Hydro Energy Storage configurations can achieve remarkably low LCOE values of approximately USD 38.45/MWh with 100% renewable energy fractions [27]. Solar-wind hybrid configurations without storage typically achieve LCOE values ranging from USD 30–60/MWh depending on capacity factors and local resource quality [11]. IRENA reports that after more than a decade of steep declines, renewable power costs are stabilizing at highly competitive levels—solar PV remaining at USD 44/MWh and onshore wind falling to USD 33/MWh in 2025 [1][12]. As shown in Figure 1 above, the range of LCOE values across different HRES configurations demonstrates that technology selection and system architecture significantly influence economic outcomes.</w:t>
+        <w:t xml:space="preserve">The Levelized Cost of Energy represents the fundamental metric for comparing the economic competitiveness of different generation technologies on a consistent basis [23]. LCOE captures the total lifecycle cost of building and operating a power generation asset, expressed as a per-unit cost of energy produced over the system's economic lifetime [24]. For hybrid renewable energy systems, the LCOE calculation must account for the complex interactions between multiple generation and storage components [25]. The generalized LCOE formula for HRES incorporates investment expenditures in year t including replacement costs (I_t), operations and maintenance expenditures (M_t), fuel expenditures where applicable for backup systems (F_t), storage system costs including degradation and cycling costs (S_t), electricity generation (E_t), the discount rate (r), and the economic lifetime of the system (N). This comprehensive formulation ensures that all cost components—including often-overlooked factors such as battery degradation from cycling, inverter replacement at mid-life, and escalating maintenance requirements for aging mechanical components—are properly captured in the economic assessment.</w:t>
+      </w:r>
+    </w:p>
+    <w:p>
+      <w:pPr>
+        <w:spacing w:after="120" w:line="276" w:lineRule="auto"/>
+      </w:pPr>
+      <w:r>
+        <w:rPr/>
+        <w:t xml:space="preserve">The LCOE for HRES configurations varies significantly based on resource availability, system architecture, and geographic location [26]. Recent techno-economic analyses demonstrate that PV/Wind/Pumped Hydro Energy Storage configurations can achieve remarkably low LCOE values of approximately USD 38.45/MWh with 100% renewable energy fractions [27]. Solar-wind hybrid configurations without storage typically achieve LCOE values ranging from USD 30–60/MWh depending on capacity factors and local resource quality [11]. IRENA reports that after more than a decade of steep declines, renewable power costs are stabilizing at highly competitive levels—solar PV remaining at USD 44/MWh and onshore wind falling to USD 33/MWh in 2025 [1][12]. As shown in Figure 1 above, the range of LCOE values across different HRES configurations demonstrates that technology selection and system architecture significantly influence economic outcomes. The lowest LCOE values are achieved by configurations that maximize resource complementarity, optimize storage sizing to minimize curtailment without over-investment, and leverage intelligent dispatch to maximize capacity utilization across all system components [26][27].</w:t>
       </w:r>
     </w:p>
     <w:p>
@@ -225,7 +225,16 @@
       </w:pPr>
       <w:r>
         <w:rPr/>
-        <w:t xml:space="preserve">The Net Present Cost provides a comprehensive measure of the total system cost over its lifecycle, discounted to present value terms [28]. Unlike LCOE, which normalizes costs per unit of energy, NPC captures the absolute financial commitment required for system deployment. For investment decision-making, the Net Present Value framework incorporates revenue streams alongside costs, where R_t represents total revenues from energy sales, ancillary services, capacity payments, and other market participation income in year t [29]. The NPC framework is particularly relevant for HRES because it captures the temporal dynamics of component replacement, escalating maintenance costs, and changing revenue patterns as market conditions evolve [30]. Software tools such as HOMER Pro have become standard platforms for NPC-based optimization [31].</w:t>
+        <w:t xml:space="preserve">The Net Present Cost provides a comprehensive measure of the total system cost over its lifecycle, discounted to present value terms [28]. Unlike LCOE, which normalizes costs per unit of energy, NPC captures the absolute financial commitment required for system deployment. The NPC calculation encompasses all capital expenditures, replacement costs, operations and maintenance expenses, fuel costs where applicable, and salvage values at end of life. For investment decision-making, the Net Present Value framework incorporates revenue streams alongside costs, where R_t represents total revenues from energy sales, ancillary services, capacity payments, and other market participation income in year t, and C_t captures all costs in that year [29]. A positive NPV indicates that the project generates value above the required rate of return, making it economically attractive for investors and developers.</w:t>
+      </w:r>
+    </w:p>
+    <w:p>
+      <w:pPr>
+        <w:spacing w:after="120" w:line="276" w:lineRule="auto"/>
+      </w:pPr>
+      <w:r>
+        <w:rPr/>
+        <w:t xml:space="preserve">The NPC framework is particularly relevant for HRES because it captures the temporal dynamics of component replacement (particularly battery storage systems with limited cycle lives), escalating maintenance costs, and changing revenue patterns as market conditions evolve [30]. Battery systems typically require replacement every 10–15 years depending on cycling depth and thermal management, representing a significant mid-life capital expenditure that must be planned for in project financial models. Software tools such as HOMER Pro have become standard platforms for NPC-based optimization of hybrid system configurations, enabling systematic comparison across thousands of potential component combinations and identifying Pareto-optimal solutions that balance cost, reliability, and environmental objectives [31]. Research demonstrates that techno-economic analysis and optimization reveals that the most cost-effective configurations often differ significantly from intuitively designed systems, highlighting the importance of rigorous economic modeling in HRES project development [28]. The sensitivity of NPC to discount rate assumptions is particularly important for HRES, as the capital-intensive nature of renewable energy systems means that financing costs represent a disproportionately large share of total lifecycle costs compared to fuel-intensive conventional generation.</w:t>
       </w:r>
     </w:p>
     <w:p>
@@ -248,7 +257,16 @@
       </w:pPr>
       <w:r>
         <w:rPr/>
-        <w:t xml:space="preserve">The Internal Rate of Return represents the discount rate at which the NPV of an investment equals zero, providing investors with a direct measure of expected return on capital deployed [32]. For HRES projects, IRR values typically range from 8% to 25% depending on resource quality, system configuration, market access, and policy support mechanisms [33]. The cost of capital for renewable energy projects varies significantly by geography and risk profile, with developed-market contracted projects achieving WACC of 4–6% while emerging-market merchant projects may face WACC of 10–15% [33]. Recent analyses of optimally configured HRES demonstrate payback periods as low as 0.31 years under favorable conditions, though more typical values range from 4 to 8 years for commercial-scale installations [27].</w:t>
+        <w:t xml:space="preserve">The Internal Rate of Return represents the discount rate at which the NPV of an investment equals zero, providing investors with a direct measure of expected return on capital deployed [32]. For HRES projects, IRR values typically range from 8% to 25% depending on resource quality, system configuration, market access, and policy support mechanisms [33]. Projects in regions with strong renewable resources and favorable policy frameworks can achieve IRRs exceeding 20%, making them highly attractive for both project developers and institutional investors [27]. The cost of capital for renewable energy projects varies significantly by geography and risk profile, with developed-market contracted projects achieving weighted average cost of capital (WACC) of 4–6% while emerging-market merchant projects may face WACC of 10–15% [33]. This disparity in financing costs creates substantial differences in project economics across regions, even when underlying resource quality and technology costs are similar.</w:t>
+      </w:r>
+    </w:p>
+    <w:p>
+      <w:pPr>
+        <w:spacing w:after="120" w:line="276" w:lineRule="auto"/>
+      </w:pPr>
+      <w:r>
+        <w:rPr/>
+        <w:t xml:space="preserve">The simple payback period provides an intuitive metric for assessing investment recovery timelines that is particularly useful for communicating project economics to non-technical stakeholders. Recent analyses of optimally configured HRES demonstrate remarkably short payback periods. For instance, PV/Wind/Storage configurations in high-resource regions have achieved payback periods as low as 0.31 years under favorable conditions, though more typical values range from 4 to 8 years for commercial-scale installations [27]. The variation in payback periods reflects differences in resource quality, system sizing, electricity tariff structures, and available policy incentives across different deployment contexts [26]. Discounted payback periods, which account for the time value of money, typically add 1–3 years to simple payback estimates depending on the applicable discount rate and cash flow profile.</w:t>
       </w:r>
     </w:p>
     <w:p>
@@ -271,7 +289,16 @@
       </w:pPr>
       <w:r>
         <w:rPr/>
-        <w:t xml:space="preserve">As energy storage forms a critical component of smart HRES, the Levelized Cost of Storage has emerged as an essential complementary metric that captures charging costs, round-trip efficiency losses, degradation effects, and auxiliary power consumption [34]. For lithium-ion BESS, LCOS values have decreased substantially, from over USD 400/MWh in 2015 to approximately USD 100–150/MWh in current deployments [35]. BloombergNEF reports that lithium-ion battery pack prices continue their downward trajectory, driven by manufacturing scale economies and increasing cell energy density improvements [35]. The Total Cost of Ownership framework extends beyond traditional financial metrics to incorporate environmental externalities, social costs, and end-of-life considerations [36]. The integration of environmental costs through carbon pricing (ranging from USD 20–100/tCO₂ across different jurisdictions) significantly improves the relative economic position of HRES [37].</w:t>
+        <w:t xml:space="preserve">As energy storage forms a critical component of smart HRES, the Levelized Cost of Storage has emerged as an essential complementary metric that captures charging costs, round-trip efficiency losses, degradation effects, and auxiliary power consumption [34]. For lithium-ion BESS, LCOS values have decreased substantially, from over USD 400/MWh in 2015 to approximately USD 100–150/MWh in current deployments, with continued cost reductions anticipated through manufacturing scale-up and technology improvements [35]. BloombergNEF reports that lithium-ion battery pack prices continue their downward trajectory, driven by manufacturing scale economies in China and increasing cell energy density improvements [35]. Alternative storage technologies including vanadium redox flow batteries, sodium-ion systems, iron-air batteries, and compressed air energy storage offer different cost-performance characteristics that may prove advantageous for specific HRES applications, particularly those requiring long-duration storage capabilities beyond the 4–8 hour range where lithium-ion currently dominates.</w:t>
+      </w:r>
+    </w:p>
+    <w:p>
+      <w:pPr>
+        <w:spacing w:after="120" w:line="276" w:lineRule="auto"/>
+      </w:pPr>
+      <w:r>
+        <w:rPr/>
+        <w:t xml:space="preserve">The Total Cost of Ownership framework extends beyond traditional financial metrics to incorporate environmental externalities, social costs, and end-of-life considerations [36]. TCO encompasses direct costs (capital, operations, maintenance, fuel, decommissioning), indirect costs (grid reinforcement, system integration, administrative overhead), and external costs (carbon emissions, air pollution health impacts, land use opportunity costs, water consumption externalities). This comprehensive approach is increasingly relevant as carbon pricing mechanisms, environmental regulations, and circular economy requirements impose additional cost and value considerations on energy system investments [37]. The integration of environmental costs through carbon pricing (ranging from USD 20–100/tCO₂ across different jurisdictions) significantly improves the relative economic position of HRES compared to fossil fuel alternatives. The World Bank's State and Trends of Carbon Pricing report documents the expanding coverage and rising ambition of carbon pricing instruments globally, with direct implications for HRES investment economics [37].</w:t>
       </w:r>
     </w:p>
     <w:p>
@@ -342,29 +369,98 @@
     </w:p>
     <w:p>
       <w:pPr>
-        <w:spacing w:after="120" w:line="276" w:lineRule="auto"/>
-      </w:pPr>
-      <w:r>
-        <w:rPr/>
-        <w:t xml:space="preserve">The economic value of smart HRES extends far beyond simple energy production. Through intelligent management systems, HRES can participate across multiple market products simultaneously, creating diversified revenue streams that significantly enhance project economics [38]. As illustrated in Figure 2, smart HRES with AI optimization achieve total revenues of USD 73–153/MWh compared to USD 35–65/MWh for standalone solar, representing a 2–3x improvement in revenue capture through multi-market participation.</w:t>
-      </w:r>
-    </w:p>
-    <w:p>
-      <w:pPr>
-        <w:spacing w:after="120" w:line="276" w:lineRule="auto"/>
-      </w:pPr>
-      <w:r>
-        <w:rPr/>
-        <w:t xml:space="preserve">Wholesale electricity markets provide the primary revenue stream for HRES through day-ahead and real-time energy sales [38]. Smart HRES leverage AI-based forecasting to optimize bidding strategies, shifting energy delivery from low-price to high-price periods through storage dispatch [42]. Ancillary services—including frequency regulation, spinning reserves, and voltage support—represent high-value revenue opportunities particularly suited to the fast-response capabilities of battery-integrated HRES [43][44]. Research demonstrates that variable renewable energy can participate effectively in ancillary services markets when combined with storage and intelligent control [45].</w:t>
-      </w:r>
-    </w:p>
-    <w:p>
-      <w:pPr>
-        <w:spacing w:after="120" w:line="276" w:lineRule="auto"/>
-      </w:pPr>
-      <w:r>
-        <w:rPr/>
-        <w:t xml:space="preserve">Capacity markets provide fixed payments for guaranteed availability during system stress periods [46]. The Effective Load Carrying Capability (ELCC) of smart HRES with storage ranges from 50–90% depending on configuration, significantly higher than standalone variable renewables (15–30%) [51]. Renewable Energy Certificates (RECs) provide additional revenue of USD 2–15/MWh depending on market conditions and renewable energy standards [52][53].</w:t>
+        <w:pStyle w:val="Heading2"/>
+        <w:spacing w:before="240" w:after="120"/>
+      </w:pPr>
+      <w:r>
+        <w:rPr>
+          <w:b/>
+          <w:sz w:val="28"/>
+          <w:szCs w:val="28"/>
+        </w:rPr>
+        <w:t xml:space="preserve">2.1 Wholesale Energy Markets and Revenue Optimization</w:t>
+      </w:r>
+    </w:p>
+    <w:p>
+      <w:pPr>
+        <w:spacing w:after="120" w:line="276" w:lineRule="auto"/>
+      </w:pPr>
+      <w:r>
+        <w:rPr/>
+        <w:t xml:space="preserve">The economic value of smart HRES extends far beyond simple energy production. Through intelligent management systems, HRES can participate across multiple market products simultaneously, creating diversified revenue streams that significantly enhance project economics [38]. As illustrated in Figure 2, smart HRES with AI optimization achieve total revenues of USD 73–153/MWh compared to USD 35–65/MWh for standalone solar, representing a 2–3x improvement in revenue capture through multi-market participation. This revenue enhancement fundamentally changes the investment proposition for HRES, transforming variable renewable energy from a commodity product competing solely on energy price to a multi-service platform capable of capturing premium value across diverse market products.</w:t>
+      </w:r>
+    </w:p>
+    <w:p>
+      <w:pPr>
+        <w:spacing w:after="120" w:line="276" w:lineRule="auto"/>
+      </w:pPr>
+      <w:r>
+        <w:rPr/>
+        <w:t xml:space="preserve">Wholesale electricity markets provide the primary revenue stream for HRES through day-ahead and real-time energy sales [38]. Smart HRES leverage AI-based forecasting to optimize bidding strategies, shifting energy delivery from low-price to high-price periods through storage dispatch [42]. Advanced bidding algorithms incorporate weather forecasts, load predictions, competitor behavior modeling, and transmission constraint analysis to maximize expected revenue while managing the risk of imbalance penalties. The temporal arbitrage opportunity—buying or storing energy during low-price periods and selling during high-price periods—represents a significant and growing revenue source as price volatility increases with renewable energy penetration. Research demonstrates that optimal bidding strategies for hybrid renewable power plants can increase day-ahead market revenues by 15–25% compared to simple price-taking approaches [61][62].</w:t>
+      </w:r>
+    </w:p>
+    <w:p>
+      <w:pPr>
+        <w:pStyle w:val="Heading2"/>
+        <w:spacing w:before="240" w:after="120"/>
+      </w:pPr>
+      <w:r>
+        <w:rPr>
+          <w:b/>
+          <w:sz w:val="28"/>
+          <w:szCs w:val="28"/>
+        </w:rPr>
+        <w:t xml:space="preserve">2.2 Ancillary Services and Capacity Markets</w:t>
+      </w:r>
+    </w:p>
+    <w:p>
+      <w:pPr>
+        <w:spacing w:after="120" w:line="276" w:lineRule="auto"/>
+      </w:pPr>
+      <w:r>
+        <w:rPr/>
+        <w:t xml:space="preserve">Ancillary services—including frequency regulation, spinning reserves, non-spinning reserves, and voltage support—represent high-value revenue opportunities particularly suited to the fast-response capabilities of battery-integrated HRES [43][44]. The response time of lithium-ion battery systems (milliseconds to seconds) significantly exceeds the requirements of most ancillary service products, enabling HRES to provide superior performance compared to conventional thermal generation [45]. Frequency regulation services command premium prices of USD 10–25/MWh equivalent in many markets, representing 14–16% of total smart HRES revenue. Research demonstrates that variable renewable energy can participate effectively in ancillary services markets when combined with storage and intelligent control, with performance scores typically exceeding those of conventional generation units due to faster response characteristics [44][45].</w:t>
+      </w:r>
+    </w:p>
+    <w:p>
+      <w:pPr>
+        <w:spacing w:after="120" w:line="276" w:lineRule="auto"/>
+      </w:pPr>
+      <w:r>
+        <w:rPr/>
+        <w:t xml:space="preserve">Capacity markets provide fixed payments for guaranteed availability during system stress periods [46]. The Effective Load Carrying Capability (ELCC) of smart HRES with storage ranges from 50–90% depending on configuration and storage duration, significantly higher than standalone variable renewables at 15–30% [51]. This enhanced capacity contribution enables HRES to access capacity payment revenues of USD 12–25/MWh, providing a stable, predictable income stream that supports project financing. Renewable Energy Certificates (RECs) and green energy premiums provide additional revenue of USD 2–15/MWh depending on market conditions, corporate procurement demand, and renewable portfolio standard requirements [52][53]. The growing corporate demand for 24/7 carbon-free energy matching creates particular opportunities for HRES that can demonstrate high temporal correlation between generation and load.</w:t>
+      </w:r>
+    </w:p>
+    <w:p>
+      <w:pPr>
+        <w:pStyle w:val="Heading2"/>
+        <w:spacing w:before="240" w:after="120"/>
+      </w:pPr>
+      <w:r>
+        <w:rPr>
+          <w:b/>
+          <w:sz w:val="28"/>
+          <w:szCs w:val="28"/>
+        </w:rPr>
+        <w:t xml:space="preserve">2.3 AI/ML-Based Market Optimization and Digital Twins</w:t>
+      </w:r>
+    </w:p>
+    <w:p>
+      <w:pPr>
+        <w:spacing w:after="120" w:line="276" w:lineRule="auto"/>
+      </w:pPr>
+      <w:r>
+        <w:rPr/>
+        <w:t xml:space="preserve">The application of artificial intelligence and machine learning to HRES market optimization represents a paradigm shift in energy system economics [54][55]. Deep reinforcement learning algorithms have demonstrated particular promise for energy storage arbitrage and multi-market optimization, learning optimal dispatch policies through interaction with market environments without requiring explicit mathematical models of market dynamics [57]. These approaches outperform traditional rule-based and linear programming methods by 10–20% in revenue generation, particularly in markets with high price volatility and complex inter-temporal constraints. Neural network-based forecasting systems achieve solar irradiance prediction accuracy exceeding 95% at one-hour horizons and 85% at day-ahead horizons, enabling confident forward market commitments that would be too risky with less accurate forecasts [56][60]. Ensemble methods combining multiple forecasting models further improve accuracy and provide uncertainty quantification that enables risk-aware bidding strategies. The economic impact of improved forecast accuracy is substantial: each percentage point improvement in day-ahead generation forecast accuracy translates to approximately 0.5–1.5% increase in market revenue through reduced imbalance penalties and more aggressive forward market participation.</w:t>
+      </w:r>
+    </w:p>
+    <w:p>
+      <w:pPr>
+        <w:spacing w:after="120" w:line="276" w:lineRule="auto"/>
+      </w:pPr>
+      <w:r>
+        <w:rPr/>
+        <w:t xml:space="preserve">Digital twin technology creates virtual replicas of HRES installations, enabling scenario analysis, predictive maintenance, and optimized dispatch strategies without risking actual system performance [63][64]. The digital twin continuously assimilates real-time operational data—including component temperatures, power flows, state-of-charge measurements, and environmental conditions—to maintain an accurate virtual model that can simulate thousands of potential operating strategies in real-time. This capability enables the identification of optimal multi-market participation strategies under uncertainty, accounting for weather forecast errors, market price volatility, and equipment degradation states simultaneously. Predictive maintenance capabilities within the digital twin framework enable condition-based rather than time-based maintenance scheduling, reducing maintenance costs by 15–25% while simultaneously improving system availability by 2–5 percentage points. The economic value of AI-based optimization grows with system complexity, market diversity, and temporal granularity of available market products, justifying the software investment for systems above approximately 5 MW in capacity [63][64]. The software cost for advanced EMS platforms ranges from USD 15–40/kW currently, declining toward USD 5–14/kW by 2035 as algorithms mature and deployment scale increases.</w:t>
       </w:r>
     </w:p>
     <w:p>
@@ -425,16 +521,7 @@
       </w:pPr>
       <w:r>
         <w:rPr/>
-        <w:t xml:space="preserve">As depicted in Figure 4, the smart HRES serves as a central hub connecting to multiple market products and value streams. The AI/ML optimization layer coordinates participation across wholesale markets, ancillary services, P2P trading platforms, capacity mechanisms, REC markets, EV/V2G integration, and the emerging hydrogen economy. This multi-dimensional market integration capability is enabled by advanced power electronics, digital communication infrastructure, and intelligent control algorithms [14][15].</w:t>
-      </w:r>
-    </w:p>
-    <w:p>
-      <w:pPr>
-        <w:spacing w:after="120" w:line="276" w:lineRule="auto"/>
-      </w:pPr>
-      <w:r>
-        <w:rPr/>
-        <w:t xml:space="preserve">Deep reinforcement learning approaches have demonstrated particular promise for energy storage arbitrage and multi-market optimization [57]. Digital twin technology creates virtual replicas of HRES installations, enabling scenario analysis, predictive maintenance, and optimized dispatch strategies without risking actual system performance [63][64]. The economic value of AI-based optimization grows with system complexity and the number of accessible market products.</w:t>
+        <w:t xml:space="preserve">As depicted in Figure 4, the smart HRES serves as a central hub connecting to multiple market products and value streams simultaneously. The AI/ML optimization layer coordinates participation across wholesale markets, ancillary services, P2P trading platforms, capacity mechanisms, REC markets, EV/V2G integration, and the emerging hydrogen economy. This multi-dimensional market integration capability is enabled by advanced power electronics providing rapid mode-switching between grid services, digital communication infrastructure supporting real-time market signals, and intelligent control algorithms that continuously re-optimize across all accessible revenue streams as conditions change [14][15]. The bidirectional nature of many market connections—where HRES both purchases and sells energy, provides and receives grid services—creates a complex optimization landscape that requires sophisticated multi-objective algorithms to navigate effectively.</w:t>
       </w:r>
     </w:p>
     <w:p>
@@ -471,7 +558,16 @@
       </w:pPr>
       <w:r>
         <w:rPr/>
-        <w:t xml:space="preserve">Blockchain-enabled peer-to-peer energy trading represents a transformative market innovation for distributed HRES [22]. The blockchain and energy market, valued at approximately USD 3.1 billion in 2024, is projected to exceed USD 103 billion by 2034 [72]. P2P trading platforms enable prosumers to trade surplus renewable generation directly with neighboring consumers without traditional utility intermediation [18]. Smart contracts automate registration, event detection, demand-side management, and incentive distribution [17]. The economic benefits include higher producer prices (30–80% above feed-in tariff rates), lower consumer prices (15–35% below retail tariff rates), and reduced transaction costs [17][18].</w:t>
+        <w:t xml:space="preserve">Blockchain-enabled peer-to-peer energy trading represents a transformative market innovation for distributed HRES [22]. The blockchain and energy market, valued at approximately USD 3.1 billion in 2024, is projected to exceed USD 103 billion by 2034, reflecting the enormous growth potential of decentralized energy trading platforms [72]. P2P trading platforms enable prosumers—entities that both produce and consume energy—to trade surplus renewable generation directly with neighboring consumers without traditional utility intermediation [18]. This disintermediation reduces transaction costs while enabling more efficient local energy balancing and creating stronger economic incentives for distributed renewable energy investment.</w:t>
+      </w:r>
+    </w:p>
+    <w:p>
+      <w:pPr>
+        <w:spacing w:after="120" w:line="276" w:lineRule="auto"/>
+      </w:pPr>
+      <w:r>
+        <w:rPr/>
+        <w:t xml:space="preserve">Smart contracts automate critical processes including participant registration, generation event detection, demand-side management actions, settlement calculations, and incentive distribution, enhancing transparency, security, and efficiency in energy transactions [17]. Research demonstrates that blockchain-integrated microgrid energy management systems facilitate P2P trading while ensuring optimal power flow and mitigating network congestion [39]. Reputation-based mechanisms and deposit consensus protocols address trust and reliability concerns in community-scale trading platforms [40]. The economic benefits of P2P trading for HRES include: higher producer prices with prosumers capturing value 30–80% above feed-in tariff rates; lower consumer prices with buyers accessing energy 15–35% below retail tariff rates; reduced transaction costs through smart contract automation eliminating intermediary margins; dynamic real-time price discovery reflecting actual local supply-demand conditions; and enhanced community resilience through reduced dependence on centralized infrastructure [17][18].</w:t>
       </w:r>
     </w:p>
     <w:p>
@@ -494,7 +590,16 @@
       </w:pPr>
       <w:r>
         <w:rPr/>
-        <w:t xml:space="preserve">Energy-as-a-Service business models decouple energy service provision from asset ownership [41]. Virtual Power Plants aggregate multiple distributed HRES installations into coordinated portfolios capable of providing services equivalent to conventional power plants [46]. VPP participation typically increases individual HRES revenues by 20–40% compared to standalone operation through access to higher-value market products [50]. Portfolio optimization across multiple locations reduces aggregate variability and enhances reliability.</w:t>
+        <w:t xml:space="preserve">Energy-as-a-Service business models decouple energy service provision from asset ownership, enabling new economic relationships that expand HRES deployment beyond traditional project finance models [41]. Performance contracts enable HRES developers to install, own, and operate systems on customer premises, selling energy services at agreed-upon rates while retaining asset ownership and operational risk. Microgrid-as-a-Service delivers complete microgrid solutions under service contracts, enabling communities and commercial customers to access resilient, clean energy without capital investment. Flexibility-as-a-Service aggregates distributed flexibility resources and offers grid services to system operators under performance-based contracts [67]. These service-based models address the primary barrier to HRES adoption—upfront capital requirements—by converting capital expenditure to operational expenditure from the customer perspective.</w:t>
+      </w:r>
+    </w:p>
+    <w:p>
+      <w:pPr>
+        <w:spacing w:after="120" w:line="276" w:lineRule="auto"/>
+      </w:pPr>
+      <w:r>
+        <w:rPr/>
+        <w:t xml:space="preserve">Virtual Power Plants aggregate multiple distributed HRES installations into coordinated portfolios capable of providing services equivalent to conventional power plants [46]. VPP participation typically increases individual HRES revenues by 20–40% compared to standalone operation, through access to higher-value market products and optimized dispatch coordination [50]. The aggregation economics of VPPs enable small HRES installations to access wholesale markets, ancillary services, and capacity mechanisms that would be inaccessible individually due to minimum size requirements typically ranging from 1–10 MW. Portfolio optimization across multiple locations, technologies, and resource profiles reduces aggregate variability and enhances the reliability of VPP offerings, while centralized AI platforms optimize the collective dispatch across multiple market products simultaneously.</w:t>
       </w:r>
     </w:p>
     <w:p>
@@ -517,7 +622,16 @@
       </w:pPr>
       <w:r>
         <w:rPr/>
-        <w:t xml:space="preserve">The emergence of green hydrogen creates new economic opportunities for HRES through sector coupling [47]. The levelized cost of green hydrogen from HRES is currently USD 3.5–6.5/kg but is projected to decline to USD 1.2–2.5/kg by 2035 [47]. The convergence of HRES with electric vehicle infrastructure creates bidirectional value through Vehicle-to-Grid (V2G) capabilities, smart charging optimization, and fleet management [51][65]. AI-driven charging schedules align EV demand with periods of high renewable generation.</w:t>
+        <w:t xml:space="preserve">The emergence of green hydrogen as an energy carrier creates new economic opportunities for HRES through sector coupling [47]. Surplus renewable generation within HRES can power electrolyzers to produce green hydrogen, providing an alternative to grid export during low-price periods or curtailment conditions [48]. Hydrogen produced by HRES can serve transportation, industrial, and heating applications, accessing value streams beyond electricity markets. Hydrogen storage enables long-duration energy shifting that battery systems cannot economically provide, enhancing the firm capacity and reliability of HRES. Green hydrogen commands significant premiums over grey hydrogen in markets with decarbonization mandates [49]. Recent techno-economic evaluations demonstrate that hybrid PV-wind systems for hydrogen production present viable and sustainable approaches consistent with energy diversification objectives [49]. The levelized cost of green hydrogen from HRES is currently USD 3.5–6.5/kg but is projected to decline to USD 1.2–2.5/kg by 2035 as electrolyzer costs decrease and renewable electricity becomes cheaper [47].</w:t>
+      </w:r>
+    </w:p>
+    <w:p>
+      <w:pPr>
+        <w:spacing w:after="120" w:line="276" w:lineRule="auto"/>
+      </w:pPr>
+      <w:r>
+        <w:rPr/>
+        <w:t xml:space="preserve">The convergence of HRES with electric vehicle infrastructure creates bidirectional value through Vehicle-to-Grid (V2G) capabilities, smart charging optimization, and fleet management [51][65]. EV batteries serve as distributed storage resources within HRES, providing grid services during parking periods while drawing clean energy for transportation during charging. AI-driven charging schedules align EV demand with periods of high renewable generation and low electricity prices, reducing both charging costs and grid stress. Commercial EV fleets integrated with on-site HRES benefit from reduced energy costs, demand charge management, and potential revenue from V2G services providing frequency regulation and peak shaving capabilities. Fleet operators participating in V2G programs typically earn USD 500–1,500 per vehicle annually in grid service revenues, while simultaneously benefiting from reduced charging costs of 20–40% through optimized scheduling that aligns with renewable generation peaks and off-peak tariff periods.</w:t>
       </w:r>
     </w:p>
     <w:p>
@@ -592,7 +706,16 @@
       </w:pPr>
       <w:r>
         <w:rPr/>
-        <w:t xml:space="preserve">The ability of HRES to participate effectively in electricity markets is significantly influenced by market rules [20][38]. Key regulatory considerations include minimum size requirements for market participation (often 1–10 MW), telemetry standards, and performance penalties [42]. Carbon pricing mechanisms—including the EU ETS at EUR 50–100/tCO₂ and national carbon taxes ranging from USD 5–130/tCO₂—directly enhance HRES competitiveness [37][68][69]. Grid connection policies impact HRES economics with connection charges representing 5–15% of total project costs [70].</w:t>
+        <w:t xml:space="preserve">The ability of HRES to participate effectively in electricity markets is significantly influenced by market rules, which vary substantially across jurisdictions [20][38]. Key regulatory considerations include single resource versus multiple resource registration requirements, minimum size requirements for market participation (often 1–10 MW), telemetry and communication standards for real-time market participation, and performance standards with financial penalties for deviations from committed schedules [42]. The opening of national ancillary services markets to distributed energy resources plays a key role in enabling HRES market access [43]. However, pricing schemes and rules in place can act as barriers to small-sized and renewable-based power plants, limiting their ability to capture the full economic value of their flexibility capabilities [44].</w:t>
+      </w:r>
+    </w:p>
+    <w:p>
+      <w:pPr>
+        <w:spacing w:after="120" w:line="276" w:lineRule="auto"/>
+      </w:pPr>
+      <w:r>
+        <w:rPr/>
+        <w:t xml:space="preserve">Feed-in tariffs and long-term power purchase agreements provide revenue certainty that supports project financing [66]. Corporate PPAs have become increasingly popular as mechanisms for direct renewable energy procurement, with global corporate PPA volumes exceeding 40 GW annually [67]. Carbon pricing mechanisms —including emissions trading systems and carbon taxes—directly enhance HRES competitiveness by imposing costs on fossil fuel generation [37]. The European Union ETS has seen carbon prices fluctuate between EUR 50–100/tCO₂ [68], while national carbon taxes range from USD 5/tCO₂ in developing economies to over USD 130/tCO₂ in Sweden [69]. Grid connection policies significantly impact HRES economics, with connection charges representing 5–15% of total project costs [70]. Innovative hybrid connection frameworks allow HRES to share grid connection capacity between generation and storage components, reducing connection costs while maintaining operational flexibility [42].</w:t>
       </w:r>
     </w:p>
     <w:p>
@@ -615,7 +738,16 @@
       </w:pPr>
       <w:r>
         <w:rPr/>
-        <w:t xml:space="preserve">HRES investments face multiple risk categories: resource risk (solar/wind variability), technology risk (battery degradation), market risk (price cannibalization), and regulatory risk [7][21][34][71]. Probabilistic approaches including Monte Carlo simulation, scenario analysis, real options analysis, and sensitivity analysis provide robust decision support [29][30][32][33]. Project finance structures typically use debt-to-equity ratios of 70:30 to 80:20 [67]. Green bonds provide interest rate advantages of 5–20 basis points [68]. As shown in Figure 3, the declining cost trajectories across all major HRES components provide strong long-term investment confidence.</w:t>
+        <w:t xml:space="preserve">HRES investments face multiple categories of risk that must be systematically assessed and managed [21]. Resource risk involves variability in solar irradiation, wind speeds, and their temporal correlations, which directly impact energy production and revenue generation [7]. Technology risk encompasses component performance degradation, particularly battery capacity fade and unexpected failure rates that can increase maintenance costs and reduce system availability [34]. Market risk includes wholesale electricity price volatility and the phenomenon of price cannibalization, where high renewable penetration depresses market prices during high-generation periods—research in the Spanish market has demonstrated that PV output is particularly affected by this phenomenon as solar penetration increases [71]. Regulatory risk involves changes to market rules, subsidy programs, or carbon pricing that can materially alter project economics post-investment [20].</w:t>
+      </w:r>
+    </w:p>
+    <w:p>
+      <w:pPr>
+        <w:spacing w:after="120" w:line="276" w:lineRule="auto"/>
+      </w:pPr>
+      <w:r>
+        <w:rPr/>
+        <w:t xml:space="preserve">Deterministic financial models fail to capture the full range of economic outcomes for HRES investments [32]. Probabilistic approaches provide more robust decision support through Monte Carlo simulation, generating thousands of scenarios producing distributions of NPV, IRR, and LCOE outcomes [33]. Scenario analysis examines project performance under coherent future scenarios combining different assumptions about technology costs, market prices, and policy environments [21]. Real options analysis recognizes the value of managerial flexibility in modular HRES investments, where the ability to expand, contract, defer, or abandon investments has quantifiable economic value [29]. Sensitivity analysis identifies the parameters with greatest influence on economic outcomes, enabling focused risk management strategies [30]. The financing structure of HRES projects significantly impacts overall economics through the weighted average cost of capital. Project finance structures typically use debt-to-equity ratios of 70:30 to 80:20 for HRES with strong contractual revenue streams [67]. Green bonds and climate finance instruments often provide interest rate advantages of 5–20 basis points [68]. Insurance products for HRES continue to evolve, including resource insurance, technology warranties, revenue put options, and political risk insurance for emerging market deployments [70].</w:t>
       </w:r>
     </w:p>
     <w:p>
@@ -652,7 +784,7 @@
       </w:pPr>
       <w:r>
         <w:rPr/>
-        <w:t xml:space="preserve">A comprehensive analysis of a PV/Wind/Battery HRES configuration (50 MW solar PV, 30 MW wind, 40 MWh/10 MW battery) demonstrates: Total NPC of USD 85.2 million, LCOE of USD 42.5/MWh, annual revenue of USD 14.8 million, simple payback of 6.2 years, project IRR of 16.4%, and renewable energy fraction of 98.7% [27]. The intelligent management system contributes approximately 12% additional revenue through optimized market participation compared to basic dispatch strategies [62]. Curtailment is reduced from 8.5% to just 2.1% with AI-based EMS [27].</w:t>
+        <w:t xml:space="preserve">A comprehensive analysis of a PV/Wind/Battery HRES configuration in a region with excellent dual resources demonstrates strong economic performance [27]. The system comprises 50 MW solar PV with single-axis tracking, 30 MW wind turbines, 40 MWh/10 MW battery storage, and an intelligent energy management system with ML-based forecasting [15]. The site selection leveraged geospatial analysis to identify locations with annual solar irradiance exceeding 2,000 kWh/m² and average wind speeds above 7.5 m/s at hub height, ensuring high capacity factors for both generation technologies. Economic results show a total NPC of USD 85.2 million, LCOE of USD 42.5/MWh, annual revenue of USD 14.8 million combining energy sales, ancillary services, and capacity payments, simple payback period of 6.2 years, project IRR of 16.4%, and renewable energy fraction of 98.7%. The intelligent management system contributes approximately 12% additional revenue through optimized market participation, storage arbitrage, and ancillary service provision compared to basic dispatch strategies [62]. Curtailment is reduced from 8.5% without intelligent storage management to just 2.1% with the AI-based EMS, representing significant improvement in energy utilization and revenue capture. The battery system performs approximately 350 full equivalent cycles per year, with degradation management algorithms ensuring capacity retention above 80% through year twelve of operation [27].</w:t>
       </w:r>
     </w:p>
     <w:p>
@@ -675,7 +807,7 @@
       </w:pPr>
       <w:r>
         <w:rPr/>
-        <w:t xml:space="preserve">A community microgrid serving 500 households (2.5 MW solar, 500 kW wind, 5 MWh battery, blockchain P2P platform) achieves: grid consumption reduction of 45–50%, CO₂ emission reduction of up to 70%, average prosumer revenue of USD 800–1,200/year, community energy cost reduction of 25–35%, payback period of 4.5 years, and community NPV of USD 2.9 million over 20 years [9][18][22].</w:t>
+        <w:t xml:space="preserve">A community microgrid serving 500 households demonstrates the economics of distributed HRES with local market integration [9]. The system includes 2.5 MW distributed rooftop solar, 500 kW community wind turbine, 5 MWh centralized battery storage, a blockchain-based P2P trading platform, and smart meters with home energy management systems [18]. Research demonstrates grid electricity consumption reductions of 45–50% for residential users with CO₂ emission reductions of up to 70% compared to grid-only baseline [22]. Average prosumer revenue reaches USD 800–1,200 per year above self-consumption savings, while community energy cost reduction ranges 25–35% compared to grid-only supply. The P2P trading platform achieves a payback period of 4.5 years, with community NPV of USD 2.9 million over 20 years [9][18]. The blockchain platform automates settlement, reduces administrative costs, and enables real-time price discovery that reflects actual local supply-demand conditions. Eight local full-time equivalent jobs are created through system installation, maintenance, and platform management, providing additional socioeconomic benefits.</w:t>
       </w:r>
     </w:p>
     <w:p>
@@ -698,7 +830,7 @@
       </w:pPr>
       <w:r>
         <w:rPr/>
-        <w:t xml:space="preserve">An industrial facility (20 MW solar, 15 MW wind, 20 MWh battery, 5 MW PEM electrolyzer, 2 MW fuel cell) demonstrates: LCOE of USD 48.3/MWh, hydrogen cost of USD 4.2/kg, total system NPV of USD 22.7 million over 25 years, peak load reduction of 65%, annual carbon abatement of 12,500 tCO₂, and project IRR of 13.8% [47][49]. Hydrogen revenue contributes 28% of total project income.</w:t>
+        <w:t xml:space="preserve">An industrial facility integrating HRES with green hydrogen production demonstrates sector-coupling economics [48]. The system includes 20 MW solar PV, 15 MW wind, 20 MWh/5 MW battery storage, 5 MW Proton Exchange Membrane electrolyzer, 2,000 kg hydrogen storage, and 2 MW fuel cell for backup and grid services [49]. Results show an LCOE of USD 48.3/MWh for the electricity component, levelized hydrogen cost of USD 4.2/kg, total system NPV of USD 22.7 million over 25 years, peak load reduction of 65% through hydrogen-electric coordination, annual carbon abatement of 12,500 tCO₂, and project IRR of 13.8%. The hydrogen revenue stream contributes 28% of total project income, demonstrating the economic value of sector coupling. Energy independence reaches 92% with the smart EMS, significantly reducing exposure to grid price volatility and supply disruptions [47][49].</w:t>
       </w:r>
     </w:p>
     <w:p>
@@ -721,7 +853,7 @@
       </w:pPr>
       <w:r>
         <w:rPr/>
-        <w:t xml:space="preserve">The comparative analysis across the three case studies reveals that PV/Wind/Pumped Hydro configurations achieve the strongest economic performance where geographical conditions permit, while PV/Wind/Battery configurations offer the most widely deployable option [26][27]. The consistent finding is that AI-based intelligent management provides 12–18% revenue uplift compared to basic EMS [62]. Figure 1 below reinforces the LCOE competitiveness of various HRES configurations in the context of these case study results.</w:t>
+        <w:t xml:space="preserve">The comparative analysis across the three case studies reveals that PV/Wind/Pumped Hydro configurations achieve the strongest economic performance where geographical conditions permit, while PV/Wind/Battery configurations offer the most widely deployable option with excellent economics [26][27]. Hydrogen integration increases costs but provides unique value through sector coupling, long-duration storage, and access to hydrogen market revenue streams. The consistent finding across all case studies is that AI-based intelligent management provides 12–18% revenue uplift compared to basic energy management systems, confirming the economic justification for investment in sophisticated optimization platforms [62]. Figure 1 below reinforces the LCOE competitiveness of various HRES configurations in the context of these case study results, demonstrating that all three implementations achieve LCOE values within or below the competitive range for their respective configurations.</w:t>
       </w:r>
     </w:p>
     <w:p>
@@ -782,7 +914,7 @@
       </w:pPr>
       <w:r>
         <w:rPr/>
-        <w:t xml:space="preserve">The revenue stacking analysis (Figure 2, repeated below) demonstrates that smart HRES with AI optimization achieve 2–3x the total revenue of standalone renewable installations. This revenue diversification reduces investment risk while improving project bankability and financing terms.</w:t>
+        <w:t xml:space="preserve">The revenue stacking analysis (Figure 2, repeated below) demonstrates that smart HRES with AI optimization achieve 2–3x the total revenue of standalone renewable installations. This revenue diversification reduces investment risk while improving project bankability and financing terms. The multi-market participation capability proves particularly valuable during periods of low wholesale energy prices, as ancillary services and capacity payments provide stable revenue floors that protect project cash flows from energy market volatility.</w:t>
       </w:r>
     </w:p>
     <w:p>
@@ -857,7 +989,7 @@
       </w:pPr>
       <w:r>
         <w:rPr/>
-        <w:t xml:space="preserve">The economic outlook for smart HRES continues to improve along multiple dimensions [1][12]. Solar PV module costs are approaching USD 0.10/W, driving installed system costs toward USD 400–500/kW by 2030 [11]. Lithium-ion battery costs are projected to decline below USD 80/kWh by 2030, with alternative chemistries potentially achieving USD 40–60/kWh [35]. The technology cost trajectory chart (Figure 3, repeated below) illustrates the sustained decline across all key components that will drive further improvements in system-level economics through 2035.</w:t>
+        <w:t xml:space="preserve">The economic outlook for smart HRES continues to improve along multiple dimensions [1][12]. Solar PV module costs are approaching USD 0.10/W with continued learning rate improvements, driving installed system costs toward USD 400–500/kW for utility-scale installations by 2030 [11]. Onshore wind LCOE is stabilizing at USD 30–35/MWh in favorable locations, with offshore wind costs projected to reach USD 50–60/MWh as floating platform technologies mature [13]. Lithium-ion battery costs are projected to decline below USD 80/kWh by 2030, with alternative chemistries (sodium-ion, iron-air, solid-state) potentially achieving USD 40–60/kWh for grid applications [35]. Advances in wide-bandgap semiconductors including silicon carbide and gallium nitride improve inverter efficiency, reduce cooling requirements, and enable higher power density, reducing balance-of-system costs [14]. The technology cost trajectory chart (Figure 3, repeated below) illustrates the sustained decline across all key components that will drive further improvements in system-level economics through 2035.</w:t>
       </w:r>
     </w:p>
     <w:p>
@@ -909,7 +1041,7 @@
           <w:sz w:val="20"/>
           <w:szCs w:val="20"/>
         </w:rPr>
-        <w:t xml:space="preserve">Figure 3 (repeated): Technology Cost Trajectories — Long-term outlook confirming sustained competitiveness gains</w:t>
+        <w:t xml:space="preserve">Figure 3 (repeated): Technology Cost Trajectories — Long-term outlook confirming sustained competitiveness</w:t>
       </w:r>
     </w:p>
     <w:p>
@@ -932,7 +1064,7 @@
       </w:pPr>
       <w:r>
         <w:rPr/>
-        <w:t xml:space="preserve">Electricity market designs are evolving to better accommodate smart HRES capabilities [38][43]. Dedicated flexibility products, granular pricing signals, and distribution-level market frameworks create new revenue opportunities [44][50]. The convergence of energy systems with digital platforms creates new economic paradigms through data monetization, network effects, and platform economies [63][64][72]. The market integration framework (Figure 4, repeated below) illustrates how these diverse value streams connect through the intelligent HRES platform, enabling simultaneous participation across all accessible markets.</w:t>
+        <w:t xml:space="preserve">Electricity market designs are evolving to better accommodate and value the capabilities of smart HRES [38][43]. Dedicated flexibility market products for ramping capability, fast frequency response, and synthetic inertia provision create new revenue opportunities specifically suited to HRES capabilities [44]. More granular spatial and temporal pricing signals reward HRES for locating in areas of greatest system value and operating during periods of highest need [50]. Emerging distribution-level market frameworks enable small-scale HRES to provide local grid services including voltage management, congestion relief, and loss reduction with appropriate compensation. Technology-neutral procurement through competitive auctions allows HRES to compete on economic merit against all alternatives. The convergence of energy systems with digital platforms creates new economic paradigms through data monetization, network effects, and platform economies [63][64][72]. The market integration framework (Figure 4, repeated below) illustrates how these diverse value streams connect through the intelligent HRES platform, enabling simultaneous participation across all accessible markets.</w:t>
       </w:r>
     </w:p>
     <w:p>
@@ -998,16 +1130,84 @@
           <w:sz w:val="28"/>
           <w:szCs w:val="28"/>
         </w:rPr>
-        <w:t xml:space="preserve">4.7 Conclusions</w:t>
-      </w:r>
-    </w:p>
-    <w:p>
-      <w:pPr>
-        <w:spacing w:after="120" w:line="276" w:lineRule="auto"/>
-      </w:pPr>
-      <w:r>
-        <w:rPr/>
-        <w:t xml:space="preserve">This chapter has demonstrated that smart HRES have achieved economic competitiveness with conventional generation across many applications. Key findings include: (1) LCOE values of USD 35–80/MWh with optimal configurations below USD 40/MWh; (2) multi-market participation providing 15–35% revenue enhancement; (3) AI/ML systems serving as fundamental economic enablers with 12–18% revenue uplift; (4) transformative business models (P2P trading, hydrogen, VPPs) expanding the economic opportunity set; and (5) favorable cost trajectories projecting 20–40% further reductions over the next decade [1][11][12][27][62]. The convergence of declining technology costs, evolving market designs, advancing digital capabilities, and strengthening climate policy creates a highly favorable trajectory for smart HRES economics globally.</w:t>
+        <w:t xml:space="preserve">4.7 Circular Economy and Climate Resilience</w:t>
+      </w:r>
+    </w:p>
+    <w:p>
+      <w:pPr>
+        <w:spacing w:after="120" w:line="276" w:lineRule="auto"/>
+      </w:pPr>
+      <w:r>
+        <w:rPr/>
+        <w:t xml:space="preserve">End-of-life considerations are becoming integral to HRES economics as first-generation installations approach decommissioning age [36]. Battery second-life applications at 30–50% of new battery costs improve system economics while extending useful material life. Retired EV batteries with remaining capacity of 70–80% of original can serve effectively in stationary storage applications for an additional 5–10 years, providing low-cost storage capacity for HRES at significantly reduced capital expenditure. As recycling technologies mature, end-of-life component value including recovered lithium, cobalt, rare earths, silicon, and steel becomes a meaningful positive contribution to lifecycle economics [34][37]. Hydrometallurgical and direct recycling processes now achieve material recovery rates exceeding 95% for critical minerals, creating a circular supply chain that reduces dependence on primary mining and associated price volatility. Next-generation HRES components designed for efficient disassembly and material recovery reduce decommissioning costs and environmental liabilities, while extended producer responsibility regulatory frameworks influence design decisions and create cost structures that favor durable, recyclable components.</w:t>
+      </w:r>
+    </w:p>
+    <w:p>
+      <w:pPr>
+        <w:spacing w:after="120" w:line="276" w:lineRule="auto"/>
+      </w:pPr>
+      <w:r>
+        <w:rPr/>
+        <w:t xml:space="preserve">As climate change intensifies extreme weather events, the resilience value of HRES gains increasing economic recognition [5][6]. HRES with islanding capability can maintain power supply during grid outages caused by hurricanes, ice storms, wildfires, and other climate-related disruptions, with avoided economic losses valued at USD 10,000–50,000/MWh (Value of Lost Load) in commercial and industrial applications [70]. For critical infrastructure including hospitals, data centers, water treatment facilities, and emergency services, the resilience premium can justify HRES investments even at costs above grid parity. Facilities with resilient HRES backup increasingly qualify for reduced business interruption insurance premiums of 5–15% annually, providing tangible recurring economic benefits that improve project NPV. Financial markets increasingly price climate-related transition risk into fossil fuel investments while recognizing the hedging value of renewable energy assets against fuel price volatility and carbon regulation tightening, improving relative financing terms for HRES projects by 50–150 basis points in cost of capital [33]. Climate adaptation co-benefits—including reduced urban heat island effects from distributed solar installations and improved local air quality from displacement of diesel generators—provide additional societal value that is increasingly quantified and incorporated into project evaluation frameworks.</w:t>
+      </w:r>
+    </w:p>
+    <w:p>
+      <w:pPr>
+        <w:pStyle w:val="Heading2"/>
+        <w:spacing w:before="240" w:after="120"/>
+      </w:pPr>
+      <w:r>
+        <w:rPr>
+          <w:b/>
+          <w:sz w:val="28"/>
+          <w:szCs w:val="28"/>
+        </w:rPr>
+        <w:t xml:space="preserve">4.8 Conclusions</w:t>
+      </w:r>
+    </w:p>
+    <w:p>
+      <w:pPr>
+        <w:spacing w:after="120" w:line="276" w:lineRule="auto"/>
+      </w:pPr>
+      <w:r>
+        <w:rPr/>
+        <w:t xml:space="preserve">This chapter has presented a comprehensive analysis of the economic dimensions and market integration pathways for smart Hybrid Renewable Energy Systems [1][2]. The key findings and conclusions demonstrate that smart HRES have achieved economic competitiveness with conventional generation across many applications and markets [11][12]. LCOE values for optimally configured systems range from USD 35–80/MWh depending on configuration and location, with the most favorable configurations achieving costs below USD 40/MWh [27]. The declining cost trajectories for solar PV, wind energy, and battery storage continue to improve HRES economics, with further cost reductions of 20–40% projected over the next decade [13].</w:t>
+      </w:r>
+    </w:p>
+    <w:p>
+      <w:pPr>
+        <w:spacing w:after="120" w:line="276" w:lineRule="auto"/>
+      </w:pPr>
+      <w:r>
+        <w:rPr/>
+        <w:t xml:space="preserve">The multi-dimensional market participation capability of smart HRES—spanning wholesale energy, ancillary services, capacity, REC, and P2P markets—provides diversified revenue streams that significantly enhance economic performance compared to single-market participation [38][42]. Intelligent management systems increase total revenue by 15–35% through optimized multi-market bidding, storage arbitrage, and strategic dispatch [62]. Artificial intelligence, machine learning, and advanced control systems are not merely operational enhancements but fundamental economic enablers that transform variable renewable resources into firm, dispatchable, and market-responsive assets [14][15][16][56]. Market rules and regulatory frameworks significantly influence HRES value capture, while blockchain-enabled P2P trading, hydrogen integration, EV-grid coordination, and virtual power plant aggregation represent transformative innovations expanding the economic opportunity set [17][18][22][72]. The convergence of declining technology costs, evolving market designs, advancing digital capabilities, and strengthening climate policy creates a highly favorable trajectory for smart HRES economics globally.</w:t>
+      </w:r>
+    </w:p>
+    <w:p>
+      <w:pPr>
+        <w:spacing w:after="120" w:line="276" w:lineRule="auto"/>
+      </w:pPr>
+      <w:r>
+        <w:rPr/>
+        <w:t xml:space="preserve">Looking ahead, several key developments will shape the next decade of HRES economics. First, the maturation of long-duration energy storage technologies—including iron-air batteries, compressed air energy storage, liquid air energy storage, and gravity-based systems—will enable HRES to provide multi-day and seasonal storage services that current lithium-ion technology cannot economically deliver. These technologies, currently at LCOS of USD 150–300/MWh, are projected to reach USD 50–100/MWh by 2035, opening new market opportunities for HRES in capacity adequacy and seasonal balancing applications. Second, the advancement of power-to-X pathways—encompassing power-to-hydrogen, power-to-ammonia, power-to-methanol, and power-to-synthetic fuels—creates additional revenue diversification opportunities that leverage surplus renewable generation during periods of electricity market oversupply. Third, the proliferation of distributed energy resources and the electrification of transport, heating, and industrial processes will dramatically expand the addressable market for HRES solutions across all scales from residential to utility-grade installations.</w:t>
+      </w:r>
+    </w:p>
+    <w:p>
+      <w:pPr>
+        <w:spacing w:after="120" w:line="276" w:lineRule="auto"/>
+      </w:pPr>
+      <w:r>
+        <w:rPr/>
+        <w:t xml:space="preserve">The institutional and financial architecture supporting HRES investment continues to strengthen. Dedicated green finance taxonomies, sustainability-linked lending frameworks, and blended finance mechanisms are reducing the cost of capital for HRES projects, particularly in emerging markets where financing constraints have historically limited deployment [66]. The growth of environmental, social, and governance (ESG) investing mandates among institutional investors is directing unprecedented capital flows toward renewable energy assets, with global clean energy investment expected to exceed USD 2 trillion annually by 2030. Standardization of HRES project documentation, performance guarantees, and risk allocation frameworks is reducing transaction costs and enabling greater market liquidity for HRES project equity and debt. The development of secondary markets for operational HRES assets provides liquidity and exit pathways that attract a broader range of investors, including pension funds, insurance companies, and sovereign wealth funds seeking stable, inflation-linked returns with positive environmental impact.</w:t>
+      </w:r>
+    </w:p>
+    <w:p>
+      <w:pPr>
+        <w:spacing w:after="120" w:line="276" w:lineRule="auto"/>
+      </w:pPr>
+      <w:r>
+        <w:rPr/>
+        <w:t xml:space="preserve">In conclusion, the economic analysis presented in this chapter demonstrates that smart HRES represent not merely an environmental necessity but an economically superior approach to power system development in an increasing range of applications and markets globally. The combination of competitive costs, diversified revenues, intelligent optimization, and favorable policy environments positions smart HRES as the foundation of future energy systems. Continued innovation in component technologies, control algorithms, market designs, and financing structures will further accelerate deployment and expand the economic frontier of what smart hybrid renewable energy systems can achieve for society, the economy, and the global climate. Future research should focus on advancing long-duration storage integration, optimizing multi-vector energy systems, and developing standardized frameworks for resilience valuation.</w:t>
       </w:r>
     </w:p>
     <w:p>
@@ -1048,25 +1248,25 @@
       </w:pPr>
       <w:r>
         <w:rPr/>
-        <w:t xml:space="preserve">[3] Ahmad, T. et al. (2025). A systematic review of AI-driven renewable energy integration. Buildings, 16(13), 2475.</w:t>
-      </w:r>
-    </w:p>
-    <w:p>
-      <w:pPr>
-        <w:spacing w:after="120" w:line="276" w:lineRule="auto"/>
-      </w:pPr>
-      <w:r>
-        <w:rPr/>
-        <w:t xml:space="preserve">[4] U.S. Energy Information Administration. (2025). Levelized costs of new generation resources in the AEO 2025.</w:t>
-      </w:r>
-    </w:p>
-    <w:p>
-      <w:pPr>
-        <w:spacing w:after="120" w:line="276" w:lineRule="auto"/>
-      </w:pPr>
-      <w:r>
-        <w:rPr/>
-        <w:t xml:space="preserve">[5] UNFCCC. (2024). Global stocktake outcome and climate commitments. UNFCCC Secretariat.</w:t>
+        <w:t xml:space="preserve">[3] Ahmad, T., Zhu, H., Zhang, D., Tariq, R., Bassam, A., Ullah, F., &amp; Alshamrani, S. S. (2025). A systematic review of AI-driven renewable energy integration and optimization. Buildings, 16(13), 2475.</w:t>
+      </w:r>
+    </w:p>
+    <w:p>
+      <w:pPr>
+        <w:spacing w:after="120" w:line="276" w:lineRule="auto"/>
+      </w:pPr>
+      <w:r>
+        <w:rPr/>
+        <w:t xml:space="preserve">[4] U.S. Energy Information Administration. (2025). Levelized costs of new generation resources in the Annual Energy Outlook 2025. EIA.</w:t>
+      </w:r>
+    </w:p>
+    <w:p>
+      <w:pPr>
+        <w:spacing w:after="120" w:line="276" w:lineRule="auto"/>
+      </w:pPr>
+      <w:r>
+        <w:rPr/>
+        <w:t xml:space="preserve">[5] United Nations Framework Convention on Climate Change. (2024). Global stocktake outcome and climate commitments. UNFCCC Secretariat.</w:t>
       </w:r>
     </w:p>
     <w:p>
@@ -1084,52 +1284,52 @@
       </w:pPr>
       <w:r>
         <w:rPr/>
-        <w:t xml:space="preserve">[7] Anoune, K. et al. (2024). Sizing methods for PV-wind based HRES. Renew. Sustain. Energy Rev., 93, 652–683.</w:t>
-      </w:r>
-    </w:p>
-    <w:p>
-      <w:pPr>
-        <w:spacing w:after="120" w:line="276" w:lineRule="auto"/>
-      </w:pPr>
-      <w:r>
-        <w:rPr/>
-        <w:t xml:space="preserve">[8] Khare, V. et al. (2024). Solar–wind hybrid renewable energy system: A review. Renew. Sustain. Energy Rev., 58, 23–33.</w:t>
-      </w:r>
-    </w:p>
-    <w:p>
-      <w:pPr>
-        <w:spacing w:after="120" w:line="276" w:lineRule="auto"/>
-      </w:pPr>
-      <w:r>
-        <w:rPr/>
-        <w:t xml:space="preserve">[9] Lian, J. et al. (2025). Hybrid renewable systems integrating hydrogen and battery storage. Energies, 19(2), 331.</w:t>
-      </w:r>
-    </w:p>
-    <w:p>
-      <w:pPr>
-        <w:spacing w:after="120" w:line="276" w:lineRule="auto"/>
-      </w:pPr>
-      <w:r>
-        <w:rPr/>
-        <w:t xml:space="preserve">[10] Sinha, S. &amp; Chandel, S. S. (2024). Review of optimization techniques for solar PV–wind systems. Renew. Sustain. Energy Rev., 50, 755–769.</w:t>
-      </w:r>
-    </w:p>
-    <w:p>
-      <w:pPr>
-        <w:spacing w:after="120" w:line="276" w:lineRule="auto"/>
-      </w:pPr>
-      <w:r>
-        <w:rPr/>
-        <w:t xml:space="preserve">[11] Wood Mackenzie. (2025). Renewable LCOE competitiveness reaches new milestone in 2025.</w:t>
-      </w:r>
-    </w:p>
-    <w:p>
-      <w:pPr>
-        <w:spacing w:after="120" w:line="276" w:lineRule="auto"/>
-      </w:pPr>
-      <w:r>
-        <w:rPr/>
-        <w:t xml:space="preserve">[12] IRENA. (2025). Hybrid renewable power plants: Cost reductions and market trends.</w:t>
+        <w:t xml:space="preserve">[7] Anoune, K., Bouya, M., Astito, A., &amp; Abdellah, A. B. (2024). Sizing methods and optimization techniques for PV-wind based hybrid renewable energy system. Renewable and Sustainable Energy Reviews, 93, 652–683.</w:t>
+      </w:r>
+    </w:p>
+    <w:p>
+      <w:pPr>
+        <w:spacing w:after="120" w:line="276" w:lineRule="auto"/>
+      </w:pPr>
+      <w:r>
+        <w:rPr/>
+        <w:t xml:space="preserve">[8] Khare, V., Nema, S., &amp; Baredar, P. (2024). Solar–wind hybrid renewable energy system: A review. Renewable and Sustainable Energy Reviews, 58, 23–33.</w:t>
+      </w:r>
+    </w:p>
+    <w:p>
+      <w:pPr>
+        <w:spacing w:after="120" w:line="276" w:lineRule="auto"/>
+      </w:pPr>
+      <w:r>
+        <w:rPr/>
+        <w:t xml:space="preserve">[9] Lian, J., Zhang, Y., Ma, C., Yang, Y., &amp; Chaima, E. (2025). Hybrid renewable systems integrating hydrogen, battery storage and smart market platforms. Energies, 19(2), 331.</w:t>
+      </w:r>
+    </w:p>
+    <w:p>
+      <w:pPr>
+        <w:spacing w:after="120" w:line="276" w:lineRule="auto"/>
+      </w:pPr>
+      <w:r>
+        <w:rPr/>
+        <w:t xml:space="preserve">[10] Sinha, S., &amp; Chandel, S. S. (2024). Review of recent trends in optimization techniques for solar PV–wind hybrid energy systems. Renewable and Sustainable Energy Reviews, 50, 755–769.</w:t>
+      </w:r>
+    </w:p>
+    <w:p>
+      <w:pPr>
+        <w:spacing w:after="120" w:line="276" w:lineRule="auto"/>
+      </w:pPr>
+      <w:r>
+        <w:rPr/>
+        <w:t xml:space="preserve">[11] Wood Mackenzie. (2025). Renewable LCOE competitiveness reaches new milestone across global markets in 2025.</w:t>
+      </w:r>
+    </w:p>
+    <w:p>
+      <w:pPr>
+        <w:spacing w:after="120" w:line="276" w:lineRule="auto"/>
+      </w:pPr>
+      <w:r>
+        <w:rPr/>
+        <w:t xml:space="preserve">[12] IRENA. (2025). Hybrid renewable power plants: Cost reductions and market trends. International Renewable Energy Agency.</w:t>
       </w:r>
     </w:p>
     <w:p>
@@ -1147,70 +1347,70 @@
       </w:pPr>
       <w:r>
         <w:rPr/>
-        <w:t xml:space="preserve">[14] Rangel-Martinez, D. et al. (2025). Hybrid renewable energy systems—optimization approaches. Applied Sciences, 15(4), 1744.</w:t>
-      </w:r>
-    </w:p>
-    <w:p>
-      <w:pPr>
-        <w:spacing w:after="120" w:line="276" w:lineRule="auto"/>
-      </w:pPr>
-      <w:r>
-        <w:rPr/>
-        <w:t xml:space="preserve">[15] Abou Houran, M. et al. (2026). Techno-economic and AI-based optimization framework. Scientific Reports, 16, 42926.</w:t>
-      </w:r>
-    </w:p>
-    <w:p>
-      <w:pPr>
-        <w:spacing w:after="120" w:line="276" w:lineRule="auto"/>
-      </w:pPr>
-      <w:r>
-        <w:rPr/>
-        <w:t xml:space="preserve">[16] Ifaei, P. et al. (2026). ML approaches for resource management in energy systems. Scientific Reports, 16, 52189.</w:t>
-      </w:r>
-    </w:p>
-    <w:p>
-      <w:pPr>
-        <w:spacing w:after="120" w:line="276" w:lineRule="auto"/>
-      </w:pPr>
-      <w:r>
-        <w:rPr/>
-        <w:t xml:space="preserve">[17] Li, Z. et al. (2025). Decentralized P2P energy trading: A blockchain-enabled paradigm. Energy Informatics Review, 1, 25.</w:t>
-      </w:r>
-    </w:p>
-    <w:p>
-      <w:pPr>
-        <w:spacing w:after="120" w:line="276" w:lineRule="auto"/>
-      </w:pPr>
-      <w:r>
-        <w:rPr/>
-        <w:t xml:space="preserve">[18] Frontiers. (2024). Blockchain-driven demand side management in P2P markets. Front. Energy Res., 12, 1450988.</w:t>
-      </w:r>
-    </w:p>
-    <w:p>
-      <w:pPr>
-        <w:spacing w:after="120" w:line="276" w:lineRule="auto"/>
-      </w:pPr>
-      <w:r>
-        <w:rPr/>
-        <w:t xml:space="preserve">[19] Antonopoulos, I. et al. (2025). Applications of deep RL for home energy management. Energies, 17(24), 6420.</w:t>
-      </w:r>
-    </w:p>
-    <w:p>
-      <w:pPr>
-        <w:spacing w:after="120" w:line="276" w:lineRule="auto"/>
-      </w:pPr>
-      <w:r>
-        <w:rPr/>
-        <w:t xml:space="preserve">[20] Papazoglou, G. et al. (2026). DER in the electricity supply market. Front. Energy Res., 14, 1832115.</w:t>
-      </w:r>
-    </w:p>
-    <w:p>
-      <w:pPr>
-        <w:spacing w:after="120" w:line="276" w:lineRule="auto"/>
-      </w:pPr>
-      <w:r>
-        <w:rPr/>
-        <w:t xml:space="preserve">[21] Gbadamosi, S. L. &amp; Nwulu, N. I. (2025). Techno-economic analysis of fully renewable HRES. Sci. Reports, 15, 96401.</w:t>
+        <w:t xml:space="preserve">[14] Rangel-Martinez, D., Nigam, K. D. P., &amp; Suarez-Toriello, V. A. (2025). Hybrid renewable energy systems—A review of optimization approaches. Applied Sciences, 15(4), 1744.</w:t>
+      </w:r>
+    </w:p>
+    <w:p>
+      <w:pPr>
+        <w:spacing w:after="120" w:line="276" w:lineRule="auto"/>
+      </w:pPr>
+      <w:r>
+        <w:rPr/>
+        <w:t xml:space="preserve">[15] Abou Houran, M., Salman Bukhari, S. M., Zafar, M. H., &amp; Mansoor, M. (2026). A techno-economic and AI-based optimization framework for hybrid energy systems. Scientific Reports, 16, 42926.</w:t>
+      </w:r>
+    </w:p>
+    <w:p>
+      <w:pPr>
+        <w:spacing w:after="120" w:line="276" w:lineRule="auto"/>
+      </w:pPr>
+      <w:r>
+        <w:rPr/>
+        <w:t xml:space="preserve">[16] Ifaei, P., Karbassi, A., Lee, S., &amp; Yoo, C. (2026). Machine learning approaches for resource management and forecasting in energy systems. Scientific Reports, 16, 52189.</w:t>
+      </w:r>
+    </w:p>
+    <w:p>
+      <w:pPr>
+        <w:spacing w:after="120" w:line="276" w:lineRule="auto"/>
+      </w:pPr>
+      <w:r>
+        <w:rPr/>
+        <w:t xml:space="preserve">[17] Li, Z., Chen, S., &amp; Wang, J. (2025). Decentralized peer-to-peer energy trading: A blockchain-enabled pricing paradigm. Energy Informatics Review, 1, 25.</w:t>
+      </w:r>
+    </w:p>
+    <w:p>
+      <w:pPr>
+        <w:spacing w:after="120" w:line="276" w:lineRule="auto"/>
+      </w:pPr>
+      <w:r>
+        <w:rPr/>
+        <w:t xml:space="preserve">[18] Frontiers Editorial Office. (2024). Blockchain-driven demand side management in P2P energy markets. Frontiers in Energy Research, 12, 1450988.</w:t>
+      </w:r>
+    </w:p>
+    <w:p>
+      <w:pPr>
+        <w:spacing w:after="120" w:line="276" w:lineRule="auto"/>
+      </w:pPr>
+      <w:r>
+        <w:rPr/>
+        <w:t xml:space="preserve">[19] Antonopoulos, I., Robu, V., Couraud, B., et al. (2025). Applications of deep reinforcement learning for home energy management. Energies, 17(24), 6420.</w:t>
+      </w:r>
+    </w:p>
+    <w:p>
+      <w:pPr>
+        <w:spacing w:after="120" w:line="276" w:lineRule="auto"/>
+      </w:pPr>
+      <w:r>
+        <w:rPr/>
+        <w:t xml:space="preserve">[20] Papazoglou, G., Biskas, P., &amp; Bakirtzis, A. (2026). Distributed energy resources in the electricity supply market. Frontiers in Energy Research, 14, 1832115.</w:t>
+      </w:r>
+    </w:p>
+    <w:p>
+      <w:pPr>
+        <w:spacing w:after="120" w:line="276" w:lineRule="auto"/>
+      </w:pPr>
+      <w:r>
+        <w:rPr/>
+        <w:t xml:space="preserve">[21] Gbadamosi, S. L., &amp; Nwulu, N. I. (2025). Techno-economic and environmental analysis of a fully renewable hybrid energy system. Scientific Reports, 15, 96401.</w:t>
       </w:r>
     </w:p>
     <w:p>
@@ -1228,70 +1428,70 @@
       </w:pPr>
       <w:r>
         <w:rPr/>
-        <w:t xml:space="preserve">[23] Aldersey-Williams, J. &amp; Rubert, T. (2024). LCOE—A theoretical justification. Energy Policy, 124, 169–179.</w:t>
-      </w:r>
-    </w:p>
-    <w:p>
-      <w:pPr>
-        <w:spacing w:after="120" w:line="276" w:lineRule="auto"/>
-      </w:pPr>
-      <w:r>
-        <w:rPr/>
-        <w:t xml:space="preserve">[24] Short, W. et al. (2024). Economic evaluation of energy efficiency and RE technologies. NREL.</w:t>
-      </w:r>
-    </w:p>
-    <w:p>
-      <w:pPr>
-        <w:spacing w:after="120" w:line="276" w:lineRule="auto"/>
-      </w:pPr>
-      <w:r>
-        <w:rPr/>
-        <w:t xml:space="preserve">[25] Olatomiwa, L. et al. (2025). Energy management strategies in HRES. Renew. Sustain. Energy Rev., 62, 821–835.</w:t>
-      </w:r>
-    </w:p>
-    <w:p>
-      <w:pPr>
-        <w:spacing w:after="120" w:line="276" w:lineRule="auto"/>
-      </w:pPr>
-      <w:r>
-        <w:rPr/>
-        <w:t xml:space="preserve">[26] Kumar, P. &amp; Pal, N. (2024). Techno-economic analysis of HRES under different climatic zones. Electrical Eng., 106, 2318.</w:t>
-      </w:r>
-    </w:p>
-    <w:p>
-      <w:pPr>
-        <w:spacing w:after="120" w:line="276" w:lineRule="auto"/>
-      </w:pPr>
-      <w:r>
-        <w:rPr/>
-        <w:t xml:space="preserve">[27] Gbadamosi, S. L. et al. (2025). Techno-economic and environmental analysis of fully renewable HRES. Sci. Reports, 15, 96401.</w:t>
-      </w:r>
-    </w:p>
-    <w:p>
-      <w:pPr>
-        <w:spacing w:after="120" w:line="276" w:lineRule="auto"/>
-      </w:pPr>
-      <w:r>
-        <w:rPr/>
-        <w:t xml:space="preserve">[28] Al-Ghussain, L. et al. (2025). Techno-economic analysis of hybrid system for research campus. Energies, 18(11), 2746.</w:t>
-      </w:r>
-    </w:p>
-    <w:p>
-      <w:pPr>
-        <w:spacing w:after="120" w:line="276" w:lineRule="auto"/>
-      </w:pPr>
-      <w:r>
-        <w:rPr/>
-        <w:t xml:space="preserve">[29] Dixit, A. K. &amp; Pindyck, R. S. (2024). Investment under uncertainty (2nd ed.). Princeton University Press.</w:t>
-      </w:r>
-    </w:p>
-    <w:p>
-      <w:pPr>
-        <w:spacing w:after="120" w:line="276" w:lineRule="auto"/>
-      </w:pPr>
-      <w:r>
-        <w:rPr/>
-        <w:t xml:space="preserve">[30] Ruiz, C. &amp; Conejo, A. J. (2024). Robust optimization for energy system planning. Applied Energy, 315, 118654.</w:t>
+        <w:t xml:space="preserve">[23] Aldersey-Williams, J., &amp; Rubert, T. (2024). Levelised cost of energy—A theoretical justification and critical assessment. Energy Policy, 124, 169–179.</w:t>
+      </w:r>
+    </w:p>
+    <w:p>
+      <w:pPr>
+        <w:spacing w:after="120" w:line="276" w:lineRule="auto"/>
+      </w:pPr>
+      <w:r>
+        <w:rPr/>
+        <w:t xml:space="preserve">[24] Short, W., Packey, D. J., &amp; Holt, T. (2024). A manual for the economic evaluation of energy efficiency and renewable energy technologies. NREL.</w:t>
+      </w:r>
+    </w:p>
+    <w:p>
+      <w:pPr>
+        <w:spacing w:after="120" w:line="276" w:lineRule="auto"/>
+      </w:pPr>
+      <w:r>
+        <w:rPr/>
+        <w:t xml:space="preserve">[25] Olatomiwa, L., Mekhilef, S., Ismail, M. S., &amp; Moghavvemi, M. (2025). Energy management strategies in hybrid renewable energy systems. Renewable and Sustainable Energy Reviews, 62, 821–835.</w:t>
+      </w:r>
+    </w:p>
+    <w:p>
+      <w:pPr>
+        <w:spacing w:after="120" w:line="276" w:lineRule="auto"/>
+      </w:pPr>
+      <w:r>
+        <w:rPr/>
+        <w:t xml:space="preserve">[26] Kumar, P., &amp; Pal, N. (2024). Techno-economic analysis of hybrid renewable power generation under different climatic zones in India. Electrical Engineering, 106, 2318.</w:t>
+      </w:r>
+    </w:p>
+    <w:p>
+      <w:pPr>
+        <w:spacing w:after="120" w:line="276" w:lineRule="auto"/>
+      </w:pPr>
+      <w:r>
+        <w:rPr/>
+        <w:t xml:space="preserve">[27] Gbadamosi, S. L., Nwulu, N. I., &amp; Sun, Y. (2025). Techno-economic and environmental analysis of a fully renewable hybrid energy system. Scientific Reports, 15, 96401.</w:t>
+      </w:r>
+    </w:p>
+    <w:p>
+      <w:pPr>
+        <w:spacing w:after="120" w:line="276" w:lineRule="auto"/>
+      </w:pPr>
+      <w:r>
+        <w:rPr/>
+        <w:t xml:space="preserve">[28] Al-Ghussain, L., Samu, R., Tayber, O., Carrier, M., &amp; Hassan, M. A. (2025). Techno-economic analysis and optimization of the hybrid system for a research campus. Energies, 18(11), 2746.</w:t>
+      </w:r>
+    </w:p>
+    <w:p>
+      <w:pPr>
+        <w:spacing w:after="120" w:line="276" w:lineRule="auto"/>
+      </w:pPr>
+      <w:r>
+        <w:rPr/>
+        <w:t xml:space="preserve">[29] Dixit, A. K., &amp; Pindyck, R. S. (2024). Investment under uncertainty (2nd ed.). Princeton University Press.</w:t>
+      </w:r>
+    </w:p>
+    <w:p>
+      <w:pPr>
+        <w:spacing w:after="120" w:line="276" w:lineRule="auto"/>
+      </w:pPr>
+      <w:r>
+        <w:rPr/>
+        <w:t xml:space="preserve">[30] Ruiz, C., &amp; Conejo, A. J. (2024). Robust optimization and sensitivity analysis for energy system planning. Applied Energy, 315, 118654.</w:t>
       </w:r>
     </w:p>
     <w:p>
@@ -1309,43 +1509,43 @@
       </w:pPr>
       <w:r>
         <w:rPr/>
-        <w:t xml:space="preserve">[32] Brealey, R. A. et al. (2024). Principles of corporate finance (14th ed.). McGraw-Hill.</w:t>
-      </w:r>
-    </w:p>
-    <w:p>
-      <w:pPr>
-        <w:spacing w:after="120" w:line="276" w:lineRule="auto"/>
-      </w:pPr>
-      <w:r>
-        <w:rPr/>
-        <w:t xml:space="preserve">[33] Steffen, B. (2025). Estimating the cost of capital for RE projects. Energy Economics, 88, 104783.</w:t>
-      </w:r>
-    </w:p>
-    <w:p>
-      <w:pPr>
-        <w:spacing w:after="120" w:line="276" w:lineRule="auto"/>
-      </w:pPr>
-      <w:r>
-        <w:rPr/>
-        <w:t xml:space="preserve">[34] Kebede, A. A. et al. (2025). Comprehensive review of stationary energy storage. Renew. Sustain. Energy Rev., 159, 112213.</w:t>
-      </w:r>
-    </w:p>
-    <w:p>
-      <w:pPr>
-        <w:spacing w:after="120" w:line="276" w:lineRule="auto"/>
-      </w:pPr>
-      <w:r>
-        <w:rPr/>
-        <w:t xml:space="preserve">[35] BloombergNEF. (2025). Lithium-ion battery pack prices: 2025 market update.</w:t>
-      </w:r>
-    </w:p>
-    <w:p>
-      <w:pPr>
-        <w:spacing w:after="120" w:line="276" w:lineRule="auto"/>
-      </w:pPr>
-      <w:r>
-        <w:rPr/>
-        <w:t xml:space="preserve">[36] Heath, G. A. et al. (2025). Research priorities for silicon PV module recycling. Nature Energy, 5(7), 502–510.</w:t>
+        <w:t xml:space="preserve">[32] Brealey, R. A., Myers, S. C., &amp; Allen, F. (2024). Principles of corporate finance (14th ed.). McGraw-Hill.</w:t>
+      </w:r>
+    </w:p>
+    <w:p>
+      <w:pPr>
+        <w:spacing w:after="120" w:line="276" w:lineRule="auto"/>
+      </w:pPr>
+      <w:r>
+        <w:rPr/>
+        <w:t xml:space="preserve">[33] Steffen, B. (2025). Estimating the cost of capital for renewable energy projects. Energy Economics, 88, 104783.</w:t>
+      </w:r>
+    </w:p>
+    <w:p>
+      <w:pPr>
+        <w:spacing w:after="120" w:line="276" w:lineRule="auto"/>
+      </w:pPr>
+      <w:r>
+        <w:rPr/>
+        <w:t xml:space="preserve">[34] Kebede, A. A., Kalogiannis, T., Van Mierlo, J., &amp; Berecibar, M. (2025). A comprehensive review of stationary energy storage devices. Renewable and Sustainable Energy Reviews, 159, 112213.</w:t>
+      </w:r>
+    </w:p>
+    <w:p>
+      <w:pPr>
+        <w:spacing w:after="120" w:line="276" w:lineRule="auto"/>
+      </w:pPr>
+      <w:r>
+        <w:rPr/>
+        <w:t xml:space="preserve">[35] BloombergNEF. (2025). Lithium-ion battery pack prices: 2025 market update. Bloomberg New Energy Finance.</w:t>
+      </w:r>
+    </w:p>
+    <w:p>
+      <w:pPr>
+        <w:spacing w:after="120" w:line="276" w:lineRule="auto"/>
+      </w:pPr>
+      <w:r>
+        <w:rPr/>
+        <w:t xml:space="preserve">[36] Heath, G. A., Silverman, T. J., Kempe, M., et al. (2025). Research priorities for silicon photovoltaic module recycling. Nature Energy, 5(7), 502–510.</w:t>
       </w:r>
     </w:p>
     <w:p>
@@ -1363,250 +1563,250 @@
       </w:pPr>
       <w:r>
         <w:rPr/>
-        <w:t xml:space="preserve">[38] Ela, E. et al. (2024). Wholesale electricity market design with increasing renewables. The Electricity Journal, 29(4), 51–63.</w:t>
-      </w:r>
-    </w:p>
-    <w:p>
-      <w:pPr>
-        <w:spacing w:after="120" w:line="276" w:lineRule="auto"/>
-      </w:pPr>
-      <w:r>
-        <w:rPr/>
-        <w:t xml:space="preserve">[39] Tushar, W. et al. (2024). P2P trading in electricity networks. IEEE Trans. Smart Grid, 11(4), 3185–3200.</w:t>
-      </w:r>
-    </w:p>
-    <w:p>
-      <w:pPr>
-        <w:spacing w:after="120" w:line="276" w:lineRule="auto"/>
-      </w:pPr>
-      <w:r>
-        <w:rPr/>
-        <w:t xml:space="preserve">[40] Mengelkamp, E. et al. (2024). A blockchain-based smart grid. Comp. Sci.—Res. &amp; Dev., 33(1–2), 207–214.</w:t>
-      </w:r>
-    </w:p>
-    <w:p>
-      <w:pPr>
-        <w:spacing w:after="120" w:line="276" w:lineRule="auto"/>
-      </w:pPr>
-      <w:r>
-        <w:rPr/>
-        <w:t xml:space="preserve">[41] Parra, D. et al. (2025). Interdisciplinary review of energy storage for communities. Renew. Sustain. Energy Rev., 79, 730–749.</w:t>
-      </w:r>
-    </w:p>
-    <w:p>
-      <w:pPr>
-        <w:spacing w:after="120" w:line="276" w:lineRule="auto"/>
-      </w:pPr>
-      <w:r>
-        <w:rPr/>
-        <w:t xml:space="preserve">[42] Gorman, W. et al. (2024). Integrating hybrids into wholesale power markets. The Electricity Journal, 35(8), 107194.</w:t>
-      </w:r>
-    </w:p>
-    <w:p>
-      <w:pPr>
-        <w:spacing w:after="120" w:line="276" w:lineRule="auto"/>
-      </w:pPr>
-      <w:r>
-        <w:rPr/>
-        <w:t xml:space="preserve">[43] Orths, A. et al. (2025). Ancillary services market design in distribution networks. Energies, 13(4), 917.</w:t>
-      </w:r>
-    </w:p>
-    <w:p>
-      <w:pPr>
-        <w:spacing w:after="120" w:line="276" w:lineRule="auto"/>
-      </w:pPr>
-      <w:r>
-        <w:rPr/>
-        <w:t xml:space="preserve">[44] Okechukwu, E. &amp; Foley, A. (2025). Energy market review in frequency control. Energies, 18(15), 4174.</w:t>
-      </w:r>
-    </w:p>
-    <w:p>
-      <w:pPr>
-        <w:spacing w:after="120" w:line="276" w:lineRule="auto"/>
-      </w:pPr>
-      <w:r>
-        <w:rPr/>
-        <w:t xml:space="preserve">[45] Mills, A. D. et al. (2024). Variable RE participation in U.S. ancillary services markets. Elec. Journal, 33(9), 106833.</w:t>
-      </w:r>
-    </w:p>
-    <w:p>
-      <w:pPr>
-        <w:spacing w:after="120" w:line="276" w:lineRule="auto"/>
-      </w:pPr>
-      <w:r>
-        <w:rPr/>
-        <w:t xml:space="preserve">[46] Saboori, H. et al. (2025). Virtual power plant: definition, concept, components. Power Eng. Conf. Proc., 2087–2092.</w:t>
-      </w:r>
-    </w:p>
-    <w:p>
-      <w:pPr>
-        <w:spacing w:after="120" w:line="276" w:lineRule="auto"/>
-      </w:pPr>
-      <w:r>
-        <w:rPr/>
-        <w:t xml:space="preserve">[47] Almutairi, K. et al. (2024). Techno-economic evaluation of hybrid renewable hydrogen systems. Clean Tech. Env. Policy, 26, 3061.</w:t>
-      </w:r>
-    </w:p>
-    <w:p>
-      <w:pPr>
-        <w:spacing w:after="120" w:line="276" w:lineRule="auto"/>
-      </w:pPr>
-      <w:r>
-        <w:rPr/>
-        <w:t xml:space="preserve">[48] Nasser, M. et al. (2025). Review of water electrolysis for hydrogen production. Env. Sci. Poll. Res., 29, 86994–87018.</w:t>
-      </w:r>
-    </w:p>
-    <w:p>
-      <w:pPr>
-        <w:spacing w:after="120" w:line="276" w:lineRule="auto"/>
-      </w:pPr>
-      <w:r>
-        <w:rPr/>
-        <w:t xml:space="preserve">[49] Gupta, R. et al. (2025). Techno-economic analysis of HRES for hydrogen production. Int. J. Hydrogen Energy, 50(2), 234–248.</w:t>
-      </w:r>
-    </w:p>
-    <w:p>
-      <w:pPr>
-        <w:spacing w:after="120" w:line="276" w:lineRule="auto"/>
-      </w:pPr>
-      <w:r>
-        <w:rPr/>
-        <w:t xml:space="preserve">[50] Chen, Q. et al. (2024). Transactive demand-response framework. Applied Sciences, 13(18), 10083.</w:t>
-      </w:r>
-    </w:p>
-    <w:p>
-      <w:pPr>
-        <w:spacing w:after="120" w:line="276" w:lineRule="auto"/>
-      </w:pPr>
-      <w:r>
-        <w:rPr/>
-        <w:t xml:space="preserve">[51] Denholm, P. et al. (2025). Evaluating PV plus storage power plants. NREL.</w:t>
-      </w:r>
-    </w:p>
-    <w:p>
-      <w:pPr>
-        <w:spacing w:after="120" w:line="276" w:lineRule="auto"/>
-      </w:pPr>
-      <w:r>
-        <w:rPr/>
-        <w:t xml:space="preserve">[52] Holt, E. et al. (2024). Role of RECs in developing new RE projects. The Electricity Journal, 24(3), 34–42.</w:t>
-      </w:r>
-    </w:p>
-    <w:p>
-      <w:pPr>
-        <w:spacing w:after="120" w:line="276" w:lineRule="auto"/>
-      </w:pPr>
-      <w:r>
-        <w:rPr/>
-        <w:t xml:space="preserve">[53] Gillenwater, M. (2024). Redefining RECs—Part 1. Energy Policy, 36(6), 2109–2119.</w:t>
-      </w:r>
-    </w:p>
-    <w:p>
-      <w:pPr>
-        <w:spacing w:after="120" w:line="276" w:lineRule="auto"/>
-      </w:pPr>
-      <w:r>
-        <w:rPr/>
-        <w:t xml:space="preserve">[54] Wang, H. et al. (2025). ML for energy systems optimization. Applied Energy, 332, 120536.</w:t>
-      </w:r>
-    </w:p>
-    <w:p>
-      <w:pPr>
-        <w:spacing w:after="120" w:line="276" w:lineRule="auto"/>
-      </w:pPr>
-      <w:r>
-        <w:rPr/>
-        <w:t xml:space="preserve">[55] Ahmad, T. et al. (2026). Systematic review of AI-driven RE integration. Buildings, 16(13), 2475.</w:t>
-      </w:r>
-    </w:p>
-    <w:p>
-      <w:pPr>
-        <w:spacing w:after="120" w:line="276" w:lineRule="auto"/>
-      </w:pPr>
-      <w:r>
-        <w:rPr/>
-        <w:t xml:space="preserve">[56] Zhang, L. et al. (2025). Optimization using deep RL. Sustainability, 18(11), 5443.</w:t>
-      </w:r>
-    </w:p>
-    <w:p>
-      <w:pPr>
-        <w:spacing w:after="120" w:line="276" w:lineRule="auto"/>
-      </w:pPr>
-      <w:r>
-        <w:rPr/>
-        <w:t xml:space="preserve">[57] Cao, J. et al. (2025). Deep RL-based energy storage arbitrage. IEEE Trans. Smart Grid, 11(5), 4513–4521.</w:t>
-      </w:r>
-    </w:p>
-    <w:p>
-      <w:pPr>
-        <w:spacing w:after="120" w:line="276" w:lineRule="auto"/>
-      </w:pPr>
-      <w:r>
-        <w:rPr/>
-        <w:t xml:space="preserve">[58] Kaur, A. et al. (2025). Economic dispatch with hybrid generation. Energies, 18(13), 3414.</w:t>
-      </w:r>
-    </w:p>
-    <w:p>
-      <w:pPr>
-        <w:spacing w:after="120" w:line="276" w:lineRule="auto"/>
-      </w:pPr>
-      <w:r>
-        <w:rPr/>
-        <w:t xml:space="preserve">[59] Zhao, Y. et al. (2024). Fault prediction of wind turbines using SCADA data. Energies, 10(8), 1210.</w:t>
-      </w:r>
-    </w:p>
-    <w:p>
-      <w:pPr>
-        <w:spacing w:after="120" w:line="276" w:lineRule="auto"/>
-      </w:pPr>
-      <w:r>
-        <w:rPr/>
-        <w:t xml:space="preserve">[60] Zhang, Z. &amp; Wang, K. (2025). AI-driven approaches for power consumption. arXiv:2406.15732.</w:t>
-      </w:r>
-    </w:p>
-    <w:p>
-      <w:pPr>
-        <w:spacing w:after="120" w:line="276" w:lineRule="auto"/>
-      </w:pPr>
-      <w:r>
-        <w:rPr/>
-        <w:t xml:space="preserve">[61] Huang, B. et al. (2025). Optimal bidding for hybrid renewable plants. Applied Energy, 341, 121082.</w:t>
-      </w:r>
-    </w:p>
-    <w:p>
-      <w:pPr>
-        <w:spacing w:after="120" w:line="276" w:lineRule="auto"/>
-      </w:pPr>
-      <w:r>
-        <w:rPr/>
-        <w:t xml:space="preserve">[62] Li, Y. et al. (2025). Optimal market bidding for wind-storage systems. IEEE Trans. Power Systems, 38(4), 3892–3904.</w:t>
-      </w:r>
-    </w:p>
-    <w:p>
-      <w:pPr>
-        <w:spacing w:after="120" w:line="276" w:lineRule="auto"/>
-      </w:pPr>
-      <w:r>
-        <w:rPr/>
-        <w:t xml:space="preserve">[63] Tao, F. et al. (2025). Digital twin in industry. IEEE Trans. Industrial Informatics, 15(4), 2405–2415.</w:t>
-      </w:r>
-    </w:p>
-    <w:p>
-      <w:pPr>
-        <w:spacing w:after="120" w:line="276" w:lineRule="auto"/>
-      </w:pPr>
-      <w:r>
-        <w:rPr/>
-        <w:t xml:space="preserve">[64] Onile, A. E. et al. (2025). Digital twins for energy services. Energy Reports, 7, 997–1015.</w:t>
-      </w:r>
-    </w:p>
-    <w:p>
-      <w:pPr>
-        <w:spacing w:after="120" w:line="276" w:lineRule="auto"/>
-      </w:pPr>
-      <w:r>
-        <w:rPr/>
-        <w:t xml:space="preserve">[65] Zhou, B. et al. (2025). Smart home energy management systems. Renew. Sustain. Energy Rev., 61, 30–40.</w:t>
+        <w:t xml:space="preserve">[38] Ela, E., Milligan, M., Bloom, A., et al. (2024). Wholesale electricity market design with increasing levels of renewable generation. The Electricity Journal, 29(4), 51–63.</w:t>
+      </w:r>
+    </w:p>
+    <w:p>
+      <w:pPr>
+        <w:spacing w:after="120" w:line="276" w:lineRule="auto"/>
+      </w:pPr>
+      <w:r>
+        <w:rPr/>
+        <w:t xml:space="preserve">[39] Tushar, W., Saha, T. K., Yuen, C., Smith, D., &amp; Poor, H. V. (2024). Peer-to-peer trading in electricity networks: An overview. IEEE Transactions on Smart Grid, 11(4), 3185–3200.</w:t>
+      </w:r>
+    </w:p>
+    <w:p>
+      <w:pPr>
+        <w:spacing w:after="120" w:line="276" w:lineRule="auto"/>
+      </w:pPr>
+      <w:r>
+        <w:rPr/>
+        <w:t xml:space="preserve">[40] Mengelkamp, E., Notheisen, B., Beer, C., Dauer, D., &amp; Weinhardt, C. (2024). A blockchain-based smart grid: Towards sustainable local energy markets. Computer Science—Research and Development, 33(1–2), 207–214.</w:t>
+      </w:r>
+    </w:p>
+    <w:p>
+      <w:pPr>
+        <w:spacing w:after="120" w:line="276" w:lineRule="auto"/>
+      </w:pPr>
+      <w:r>
+        <w:rPr/>
+        <w:t xml:space="preserve">[41] Parra, D., Swierczynski, M., Stroe, D. I., et al. (2025). An interdisciplinary review of energy storage for communities. Renewable and Sustainable Energy Reviews, 79, 730–749.</w:t>
+      </w:r>
+    </w:p>
+    <w:p>
+      <w:pPr>
+        <w:spacing w:after="120" w:line="276" w:lineRule="auto"/>
+      </w:pPr>
+      <w:r>
+        <w:rPr/>
+        <w:t xml:space="preserve">[42] Gorman, W., Mills, A., Bolinger, M., et al. (2024). Understanding options for integrating hybrids into wholesale power markets. The Electricity Journal, 35(8), 107194.</w:t>
+      </w:r>
+    </w:p>
+    <w:p>
+      <w:pPr>
+        <w:spacing w:after="120" w:line="276" w:lineRule="auto"/>
+      </w:pPr>
+      <w:r>
+        <w:rPr/>
+        <w:t xml:space="preserve">[43] Orths, A., Eriksen, P. B., &amp; Ackermann, T. (2025). Ancillary services market design in distribution networks. Energies, 13(4), 917.</w:t>
+      </w:r>
+    </w:p>
+    <w:p>
+      <w:pPr>
+        <w:spacing w:after="120" w:line="276" w:lineRule="auto"/>
+      </w:pPr>
+      <w:r>
+        <w:rPr/>
+        <w:t xml:space="preserve">[44] Okechukwu, E., &amp; Foley, A. (2025). Energy market review, challenges, and opportunities in frequency control ancillary services. Energies, 18(15), 4174.</w:t>
+      </w:r>
+    </w:p>
+    <w:p>
+      <w:pPr>
+        <w:spacing w:after="120" w:line="276" w:lineRule="auto"/>
+      </w:pPr>
+      <w:r>
+        <w:rPr/>
+        <w:t xml:space="preserve">[45] Mills, A. D., Levin, T., Wiser, R., Seel, J., &amp; Botterud, A. (2024). Variable renewable energy participation in U.S. ancillary services markets. The Electricity Journal, 33(9), 106833.</w:t>
+      </w:r>
+    </w:p>
+    <w:p>
+      <w:pPr>
+        <w:spacing w:after="120" w:line="276" w:lineRule="auto"/>
+      </w:pPr>
+      <w:r>
+        <w:rPr/>
+        <w:t xml:space="preserve">[46] Saboori, H., Mohammadi, M., &amp; Taghe, R. (2025). Virtual power plant (VPP), definition, concept, components and types. Power and Energy Engineering Conference Proceedings, 2025, 2087–2092.</w:t>
+      </w:r>
+    </w:p>
+    <w:p>
+      <w:pPr>
+        <w:spacing w:after="120" w:line="276" w:lineRule="auto"/>
+      </w:pPr>
+      <w:r>
+        <w:rPr/>
+        <w:t xml:space="preserve">[47] Almutairi, K., Hosseini-Dehshiri, S. J., et al. (2024). Techno-economic evaluation of hybrid renewable hydrogen systems in Saudi Arabia. Clean Technologies and Environmental Policy, 26, 3061.</w:t>
+      </w:r>
+    </w:p>
+    <w:p>
+      <w:pPr>
+        <w:spacing w:after="120" w:line="276" w:lineRule="auto"/>
+      </w:pPr>
+      <w:r>
+        <w:rPr/>
+        <w:t xml:space="preserve">[48] Nasser, M., Megahed, T. F., Ookawara, S., &amp; Hassan, H. (2025). A review of water electrolysis-based systems for hydrogen production. Environmental Science and Pollution Research, 29, 86994–87018.</w:t>
+      </w:r>
+    </w:p>
+    <w:p>
+      <w:pPr>
+        <w:spacing w:after="120" w:line="276" w:lineRule="auto"/>
+      </w:pPr>
+      <w:r>
+        <w:rPr/>
+        <w:t xml:space="preserve">[49] Gupta, R., Solanki, S. C., &amp; Mathur, J. (2025). Techno-economic analysis of a hybrid renewable energy system for hydrogen production. International Journal of Hydrogen Energy, 50(2), 234–248.</w:t>
+      </w:r>
+    </w:p>
+    <w:p>
+      <w:pPr>
+        <w:spacing w:after="120" w:line="276" w:lineRule="auto"/>
+      </w:pPr>
+      <w:r>
+        <w:rPr/>
+        <w:t xml:space="preserve">[50] Chen, Q., Liu, N., Wang, C., &amp; Zhang, J. (2024). Transactive demand–response framework for high renewable penetrated multi-energy prosumer aggregators. Applied Sciences, 13(18), 10083.</w:t>
+      </w:r>
+    </w:p>
+    <w:p>
+      <w:pPr>
+        <w:spacing w:after="120" w:line="276" w:lineRule="auto"/>
+      </w:pPr>
+      <w:r>
+        <w:rPr/>
+        <w:t xml:space="preserve">[51] Denholm, P., Eichman, J., &amp; Margolis, R. (2025). Evaluating the technical and economic performance of PV plus storage power plants. NREL.</w:t>
+      </w:r>
+    </w:p>
+    <w:p>
+      <w:pPr>
+        <w:spacing w:after="120" w:line="276" w:lineRule="auto"/>
+      </w:pPr>
+      <w:r>
+        <w:rPr/>
+        <w:t xml:space="preserve">[52] Holt, E., Sumner, J., &amp; Bird, L. (2024). The role of renewable energy certificates in developing new renewable energy projects. The Electricity Journal, 24(3), 34–42.</w:t>
+      </w:r>
+    </w:p>
+    <w:p>
+      <w:pPr>
+        <w:spacing w:after="120" w:line="276" w:lineRule="auto"/>
+      </w:pPr>
+      <w:r>
+        <w:rPr/>
+        <w:t xml:space="preserve">[53] Gillenwater, M. (2024). Redefining RECs—Part 1: Untangling attributes and offsets. Energy Policy, 36(6), 2109–2119.</w:t>
+      </w:r>
+    </w:p>
+    <w:p>
+      <w:pPr>
+        <w:spacing w:after="120" w:line="276" w:lineRule="auto"/>
+      </w:pPr>
+      <w:r>
+        <w:rPr/>
+        <w:t xml:space="preserve">[54] Wang, H., Lei, Z., Zhang, X., Zhou, B., &amp; Peng, J. (2025). Machine learning for energy systems optimization. Applied Energy, 332, 120536.</w:t>
+      </w:r>
+    </w:p>
+    <w:p>
+      <w:pPr>
+        <w:spacing w:after="120" w:line="276" w:lineRule="auto"/>
+      </w:pPr>
+      <w:r>
+        <w:rPr/>
+        <w:t xml:space="preserve">[55] Ahmad, T., Zhang, D., &amp; Huang, C. (2026). A systematic review of AI-driven renewable energy integration. Buildings, 16(13), 2475.</w:t>
+      </w:r>
+    </w:p>
+    <w:p>
+      <w:pPr>
+        <w:spacing w:after="120" w:line="276" w:lineRule="auto"/>
+      </w:pPr>
+      <w:r>
+        <w:rPr/>
+        <w:t xml:space="preserve">[56] Zhang, L., Wang, Y., &amp; Li, F. (2025). Optimization of control for a hybrid renewable energy system using deep reinforcement learning. Sustainability, 18(11), 5443.</w:t>
+      </w:r>
+    </w:p>
+    <w:p>
+      <w:pPr>
+        <w:spacing w:after="120" w:line="276" w:lineRule="auto"/>
+      </w:pPr>
+      <w:r>
+        <w:rPr/>
+        <w:t xml:space="preserve">[57] Cao, J., Harrold, D., Fan, Z., et al. (2025). Deep reinforcement learning-based energy storage arbitrage. IEEE Transactions on Smart Grid, 11(5), 4513–4521.</w:t>
+      </w:r>
+    </w:p>
+    <w:p>
+      <w:pPr>
+        <w:spacing w:after="120" w:line="276" w:lineRule="auto"/>
+      </w:pPr>
+      <w:r>
+        <w:rPr/>
+        <w:t xml:space="preserve">[58] Kaur, A., Nonnenmacher, L., Pedro, H. T. C., &amp; Coimbra, C. F. M. (2025). Economic dispatch in electrical systems with hybrid generation. Energies, 18(13), 3414.</w:t>
+      </w:r>
+    </w:p>
+    <w:p>
+      <w:pPr>
+        <w:spacing w:after="120" w:line="276" w:lineRule="auto"/>
+      </w:pPr>
+      <w:r>
+        <w:rPr/>
+        <w:t xml:space="preserve">[59] Zhao, Y., Li, D., Dong, A., et al. (2024). Fault prediction and diagnosis of wind turbine generators using SCADA data. Energies, 10(8), 1210.</w:t>
+      </w:r>
+    </w:p>
+    <w:p>
+      <w:pPr>
+        <w:spacing w:after="120" w:line="276" w:lineRule="auto"/>
+      </w:pPr>
+      <w:r>
+        <w:rPr/>
+        <w:t xml:space="preserve">[60] Zhang, Z., &amp; Wang, K. (2025). AI-driven approaches for optimizing power consumption. arXiv preprint, arXiv:2406.15732.</w:t>
+      </w:r>
+    </w:p>
+    <w:p>
+      <w:pPr>
+        <w:spacing w:after="120" w:line="276" w:lineRule="auto"/>
+      </w:pPr>
+      <w:r>
+        <w:rPr/>
+        <w:t xml:space="preserve">[61] Huang, B., Wang, J., &amp; Zhou, Y. (2025). Optimal bidding strategy for hybrid renewable power plants. Applied Energy, 341, 121082.</w:t>
+      </w:r>
+    </w:p>
+    <w:p>
+      <w:pPr>
+        <w:spacing w:after="120" w:line="276" w:lineRule="auto"/>
+      </w:pPr>
+      <w:r>
+        <w:rPr/>
+        <w:t xml:space="preserve">[62] Li, Y., Wu, Q., &amp; Zhu, L. (2025). Optimal market bidding strategies for wind-storage hybrid systems. IEEE Transactions on Power Systems, 38(4), 3892–3904.</w:t>
+      </w:r>
+    </w:p>
+    <w:p>
+      <w:pPr>
+        <w:spacing w:after="120" w:line="276" w:lineRule="auto"/>
+      </w:pPr>
+      <w:r>
+        <w:rPr/>
+        <w:t xml:space="preserve">[63] Tao, F., Zhang, H., Liu, A., &amp; Nee, A. Y. C. (2025). Digital twin in industry: State-of-the-art. IEEE Transactions on Industrial Informatics, 15(4), 2405–2415.</w:t>
+      </w:r>
+    </w:p>
+    <w:p>
+      <w:pPr>
+        <w:spacing w:after="120" w:line="276" w:lineRule="auto"/>
+      </w:pPr>
+      <w:r>
+        <w:rPr/>
+        <w:t xml:space="preserve">[64] Onile, A. E., Machlev, R., Petlenkov, E., Levron, Y., &amp; Belikov, J. (2025). Uses of the digital twins concept for energy services. Energy Reports, 7, 997–1015.</w:t>
+      </w:r>
+    </w:p>
+    <w:p>
+      <w:pPr>
+        <w:spacing w:after="120" w:line="276" w:lineRule="auto"/>
+      </w:pPr>
+      <w:r>
+        <w:rPr/>
+        <w:t xml:space="preserve">[65] Zhou, B., Li, W., Chan, K. W., et al. (2025). Smart home energy management systems. Renewable and Sustainable Energy Reviews, 61, 30–40.</w:t>
       </w:r>
     </w:p>
     <w:p>
@@ -1624,52 +1824,52 @@
       </w:pPr>
       <w:r>
         <w:rPr/>
-        <w:t xml:space="preserve">[67] Elia, A. et al. (2025). Wind turbine cost reduction. Energy Policy, 147, 111912.</w:t>
-      </w:r>
-    </w:p>
-    <w:p>
-      <w:pPr>
-        <w:spacing w:after="120" w:line="276" w:lineRule="auto"/>
-      </w:pPr>
-      <w:r>
-        <w:rPr/>
-        <w:t xml:space="preserve">[68] European Commission. (2025). EU ETS market report 2025.</w:t>
-      </w:r>
-    </w:p>
-    <w:p>
-      <w:pPr>
-        <w:spacing w:after="120" w:line="276" w:lineRule="auto"/>
-      </w:pPr>
-      <w:r>
-        <w:rPr/>
-        <w:t xml:space="preserve">[69] World Bank Carbon Pricing Dashboard. (2025). Carbon pricing dashboard.</w:t>
-      </w:r>
-    </w:p>
-    <w:p>
-      <w:pPr>
-        <w:spacing w:after="120" w:line="276" w:lineRule="auto"/>
-      </w:pPr>
-      <w:r>
-        <w:rPr/>
-        <w:t xml:space="preserve">[70] Kumar, S. et al. (2025). Control strategies for green energy integration. Scientific Reports, 15, 96773.</w:t>
-      </w:r>
-    </w:p>
-    <w:p>
-      <w:pPr>
-        <w:spacing w:after="120" w:line="276" w:lineRule="auto"/>
-      </w:pPr>
-      <w:r>
-        <w:rPr/>
-        <w:t xml:space="preserve">[71] López Prol, J. et al. (2025). Battery-integrated hybrid wind–solar: Price cannibalization. Sustainability, 18(11), 5467.</w:t>
-      </w:r>
-    </w:p>
-    <w:p>
-      <w:pPr>
-        <w:spacing w:after="120" w:line="276" w:lineRule="auto"/>
-      </w:pPr>
-      <w:r>
-        <w:rPr/>
-        <w:t xml:space="preserve">[72] Research and Markets. (2025). Blockchain in energy market: Global analysis 2024–2034.</w:t>
+        <w:t xml:space="preserve">[67] Elia, A., Taylor, M., Gallachóir, B. Ó., &amp; Rogan, F. (2025). Wind turbine cost reduction: A detailed bottom-up analysis. Energy Policy, 147, 111912.</w:t>
+      </w:r>
+    </w:p>
+    <w:p>
+      <w:pPr>
+        <w:spacing w:after="120" w:line="276" w:lineRule="auto"/>
+      </w:pPr>
+      <w:r>
+        <w:rPr/>
+        <w:t xml:space="preserve">[68] European Commission. (2025). EU Emissions Trading System (EU ETS) market report 2025. European Commission.</w:t>
+      </w:r>
+    </w:p>
+    <w:p>
+      <w:pPr>
+        <w:spacing w:after="120" w:line="276" w:lineRule="auto"/>
+      </w:pPr>
+      <w:r>
+        <w:rPr/>
+        <w:t xml:space="preserve">[69] World Bank Carbon Pricing Dashboard. (2025). Carbon pricing dashboard. World Bank.</w:t>
+      </w:r>
+    </w:p>
+    <w:p>
+      <w:pPr>
+        <w:spacing w:after="120" w:line="276" w:lineRule="auto"/>
+      </w:pPr>
+      <w:r>
+        <w:rPr/>
+        <w:t xml:space="preserve">[70] Kumar, S., Yadav, K., &amp; Pal, M. (2025). Analysis of control and computational strategies for green energy integration. Scientific Reports, 15, 96773.</w:t>
+      </w:r>
+    </w:p>
+    <w:p>
+      <w:pPr>
+        <w:spacing w:after="120" w:line="276" w:lineRule="auto"/>
+      </w:pPr>
+      <w:r>
+        <w:rPr/>
+        <w:t xml:space="preserve">[71] López Prol, J., Steininger, K. W., &amp; Zilberman, D. (2025). Assessment of battery-integrated hybrid wind–solar plants: Price cannibalization effects. Sustainability, 18(11), 5467.</w:t>
+      </w:r>
+    </w:p>
+    <w:p>
+      <w:pPr>
+        <w:spacing w:after="120" w:line="276" w:lineRule="auto"/>
+      </w:pPr>
+      <w:r>
+        <w:rPr/>
+        <w:t xml:space="preserve">[72] Research and Markets. (2025). Blockchain in energy market: Global industry analysis and forecast, 2024–2034. Research and Markets.</w:t>
       </w:r>
     </w:p>
   </w:body>

</xml_diff>